<commit_message>
feat(research): add threshold calibration evidence
</commit_message>
<xml_diff>
--- a/paper/Intent_Bound_Memory_Capsules_Submission_Draft_v2.docx
+++ b/paper/Intent_Bound_Memory_Capsules_Submission_Draft_v2.docx
@@ -7544,7 +7544,1098 @@
           <w:color w:val="0B2545"/>
           <w:sz w:val="23"/>
         </w:rPr>
-        <w:t>8.1 Live LLM Planner Check</w:t>
+        <w:t>8.1 Threshold Calibration Check</w:t>
+      </w:r>
+    </w:p>
+    <w:p>
+      <w:pPr>
+        <w:spacing w:before="100" w:after="80"/>
+      </w:pPr>
+      <w:r>
+        <w:rPr>
+          <w:rFonts w:ascii="Calibri" w:hAnsi="Calibri"/>
+          <w:b/>
+          <w:color w:val="1F4D78"/>
+          <w:sz w:val="19"/>
+        </w:rPr>
+        <w:t>Table 9. Current-main threshold calibration sweep.</w:t>
+      </w:r>
+    </w:p>
+    <w:tbl>
+      <w:tblPr>
+        <w:tblStyle w:val="TableGrid"/>
+        <w:tblW w:type="auto" w:w="0"/>
+        <w:tblLook w:firstColumn="1" w:firstRow="1" w:lastColumn="0" w:lastRow="0" w:noHBand="0" w:noVBand="1" w:val="04A0"/>
+        <w:tblLayout w:type="fixed"/>
+      </w:tblPr>
+      <w:tblGrid>
+        <w:gridCol w:w="1235"/>
+        <w:gridCol w:w="1235"/>
+        <w:gridCol w:w="1235"/>
+        <w:gridCol w:w="1235"/>
+        <w:gridCol w:w="1235"/>
+        <w:gridCol w:w="1235"/>
+        <w:gridCol w:w="1235"/>
+        <w:gridCol w:w="1235"/>
+      </w:tblGrid>
+      <w:tr>
+        <w:tc>
+          <w:tcPr>
+            <w:tcW w:type="dxa" w:w="1235"/>
+            <w:shd w:fill="F2F4F7"/>
+            <w:tcMar>
+              <w:top w:w="80" w:type="dxa"/>
+              <w:start w:w="120" w:type="dxa"/>
+              <w:bottom w:w="80" w:type="dxa"/>
+              <w:end w:w="120" w:type="dxa"/>
+            </w:tcMar>
+            <w:vAlign w:val="center"/>
+          </w:tcPr>
+          <w:p>
+            <w:pPr>
+              <w:jc w:val="center"/>
+            </w:pPr>
+            <w:r>
+              <w:rPr>
+                <w:rFonts w:ascii="Calibri" w:hAnsi="Calibri"/>
+                <w:b/>
+                <w:color w:val="0B2545"/>
+                <w:sz w:val="17"/>
+              </w:rPr>
+              <w:t>Medium floor</w:t>
+            </w:r>
+          </w:p>
+        </w:tc>
+        <w:tc>
+          <w:tcPr>
+            <w:tcW w:type="dxa" w:w="1235"/>
+            <w:shd w:fill="F2F4F7"/>
+            <w:tcMar>
+              <w:top w:w="80" w:type="dxa"/>
+              <w:start w:w="120" w:type="dxa"/>
+              <w:bottom w:w="80" w:type="dxa"/>
+              <w:end w:w="120" w:type="dxa"/>
+            </w:tcMar>
+            <w:vAlign w:val="center"/>
+          </w:tcPr>
+          <w:p>
+            <w:pPr>
+              <w:jc w:val="center"/>
+            </w:pPr>
+            <w:r>
+              <w:rPr>
+                <w:rFonts w:ascii="Calibri" w:hAnsi="Calibri"/>
+                <w:b/>
+                <w:color w:val="0B2545"/>
+                <w:sz w:val="17"/>
+              </w:rPr>
+              <w:t>Topic floor</w:t>
+            </w:r>
+          </w:p>
+        </w:tc>
+        <w:tc>
+          <w:tcPr>
+            <w:tcW w:type="dxa" w:w="1235"/>
+            <w:shd w:fill="F2F4F7"/>
+            <w:tcMar>
+              <w:top w:w="80" w:type="dxa"/>
+              <w:start w:w="120" w:type="dxa"/>
+              <w:bottom w:w="80" w:type="dxa"/>
+              <w:end w:w="120" w:type="dxa"/>
+            </w:tcMar>
+            <w:vAlign w:val="center"/>
+          </w:tcPr>
+          <w:p>
+            <w:pPr>
+              <w:jc w:val="center"/>
+            </w:pPr>
+            <w:r>
+              <w:rPr>
+                <w:rFonts w:ascii="Calibri" w:hAnsi="Calibri"/>
+                <w:b/>
+                <w:color w:val="0B2545"/>
+                <w:sz w:val="17"/>
+              </w:rPr>
+              <w:t>ASR</w:t>
+            </w:r>
+          </w:p>
+        </w:tc>
+        <w:tc>
+          <w:tcPr>
+            <w:tcW w:type="dxa" w:w="1235"/>
+            <w:shd w:fill="F2F4F7"/>
+            <w:tcMar>
+              <w:top w:w="80" w:type="dxa"/>
+              <w:start w:w="120" w:type="dxa"/>
+              <w:bottom w:w="80" w:type="dxa"/>
+              <w:end w:w="120" w:type="dxa"/>
+            </w:tcMar>
+            <w:vAlign w:val="center"/>
+          </w:tcPr>
+          <w:p>
+            <w:pPr>
+              <w:jc w:val="center"/>
+            </w:pPr>
+            <w:r>
+              <w:rPr>
+                <w:rFonts w:ascii="Calibri" w:hAnsi="Calibri"/>
+                <w:b/>
+                <w:color w:val="0B2545"/>
+                <w:sz w:val="17"/>
+              </w:rPr>
+              <w:t>Risky action</w:t>
+            </w:r>
+          </w:p>
+        </w:tc>
+        <w:tc>
+          <w:tcPr>
+            <w:tcW w:type="dxa" w:w="1235"/>
+            <w:shd w:fill="F2F4F7"/>
+            <w:tcMar>
+              <w:top w:w="80" w:type="dxa"/>
+              <w:start w:w="120" w:type="dxa"/>
+              <w:bottom w:w="80" w:type="dxa"/>
+              <w:end w:w="120" w:type="dxa"/>
+            </w:tcMar>
+            <w:vAlign w:val="center"/>
+          </w:tcPr>
+          <w:p>
+            <w:pPr>
+              <w:jc w:val="center"/>
+            </w:pPr>
+            <w:r>
+              <w:rPr>
+                <w:rFonts w:ascii="Calibri" w:hAnsi="Calibri"/>
+                <w:b/>
+                <w:color w:val="0B2545"/>
+                <w:sz w:val="17"/>
+              </w:rPr>
+              <w:t>Benign</w:t>
+            </w:r>
+          </w:p>
+        </w:tc>
+        <w:tc>
+          <w:tcPr>
+            <w:tcW w:type="dxa" w:w="1235"/>
+            <w:shd w:fill="F2F4F7"/>
+            <w:tcMar>
+              <w:top w:w="80" w:type="dxa"/>
+              <w:start w:w="120" w:type="dxa"/>
+              <w:bottom w:w="80" w:type="dxa"/>
+              <w:end w:w="120" w:type="dxa"/>
+            </w:tcMar>
+            <w:vAlign w:val="center"/>
+          </w:tcPr>
+          <w:p>
+            <w:pPr>
+              <w:jc w:val="center"/>
+            </w:pPr>
+            <w:r>
+              <w:rPr>
+                <w:rFonts w:ascii="Calibri" w:hAnsi="Calibri"/>
+                <w:b/>
+                <w:color w:val="0B2545"/>
+                <w:sz w:val="17"/>
+              </w:rPr>
+              <w:t>FPR</w:t>
+            </w:r>
+          </w:p>
+        </w:tc>
+        <w:tc>
+          <w:tcPr>
+            <w:tcW w:type="dxa" w:w="1235"/>
+            <w:shd w:fill="F2F4F7"/>
+            <w:tcMar>
+              <w:top w:w="80" w:type="dxa"/>
+              <w:start w:w="120" w:type="dxa"/>
+              <w:bottom w:w="80" w:type="dxa"/>
+              <w:end w:w="120" w:type="dxa"/>
+            </w:tcMar>
+            <w:vAlign w:val="center"/>
+          </w:tcPr>
+          <w:p>
+            <w:pPr>
+              <w:jc w:val="center"/>
+            </w:pPr>
+            <w:r>
+              <w:rPr>
+                <w:rFonts w:ascii="Calibri" w:hAnsi="Calibri"/>
+                <w:b/>
+                <w:color w:val="0B2545"/>
+                <w:sz w:val="17"/>
+              </w:rPr>
+              <w:t>Score</w:t>
+            </w:r>
+          </w:p>
+        </w:tc>
+        <w:tc>
+          <w:tcPr>
+            <w:tcW w:type="dxa" w:w="1235"/>
+            <w:shd w:fill="F2F4F7"/>
+            <w:tcMar>
+              <w:top w:w="80" w:type="dxa"/>
+              <w:start w:w="120" w:type="dxa"/>
+              <w:bottom w:w="80" w:type="dxa"/>
+              <w:end w:w="120" w:type="dxa"/>
+            </w:tcMar>
+            <w:vAlign w:val="center"/>
+          </w:tcPr>
+          <w:p>
+            <w:pPr>
+              <w:jc w:val="center"/>
+            </w:pPr>
+            <w:r>
+              <w:rPr>
+                <w:rFonts w:ascii="Calibri" w:hAnsi="Calibri"/>
+                <w:b/>
+                <w:color w:val="0B2545"/>
+                <w:sz w:val="17"/>
+              </w:rPr>
+              <w:t>Selected</w:t>
+            </w:r>
+          </w:p>
+        </w:tc>
+      </w:tr>
+      <w:tr>
+        <w:tc>
+          <w:tcPr>
+            <w:tcW w:type="dxa" w:w="1235"/>
+            <w:tcMar>
+              <w:top w:w="80" w:type="dxa"/>
+              <w:start w:w="120" w:type="dxa"/>
+              <w:bottom w:w="80" w:type="dxa"/>
+              <w:end w:w="120" w:type="dxa"/>
+            </w:tcMar>
+            <w:vAlign w:val="center"/>
+          </w:tcPr>
+          <w:p>
+            <w:pPr>
+              <w:jc w:val="center"/>
+            </w:pPr>
+            <w:r>
+              <w:rPr>
+                <w:rFonts w:ascii="Calibri" w:hAnsi="Calibri"/>
+                <w:color w:val="111827"/>
+                <w:sz w:val="17"/>
+              </w:rPr>
+              <w:t>0.45</w:t>
+            </w:r>
+          </w:p>
+        </w:tc>
+        <w:tc>
+          <w:tcPr>
+            <w:tcW w:type="dxa" w:w="1235"/>
+            <w:tcMar>
+              <w:top w:w="80" w:type="dxa"/>
+              <w:start w:w="120" w:type="dxa"/>
+              <w:bottom w:w="80" w:type="dxa"/>
+              <w:end w:w="120" w:type="dxa"/>
+            </w:tcMar>
+            <w:vAlign w:val="center"/>
+          </w:tcPr>
+          <w:p>
+            <w:pPr>
+              <w:jc w:val="center"/>
+            </w:pPr>
+            <w:r>
+              <w:rPr>
+                <w:rFonts w:ascii="Calibri" w:hAnsi="Calibri"/>
+                <w:color w:val="111827"/>
+                <w:sz w:val="17"/>
+              </w:rPr>
+              <w:t>0.08</w:t>
+            </w:r>
+          </w:p>
+        </w:tc>
+        <w:tc>
+          <w:tcPr>
+            <w:tcW w:type="dxa" w:w="1235"/>
+            <w:tcMar>
+              <w:top w:w="80" w:type="dxa"/>
+              <w:start w:w="120" w:type="dxa"/>
+              <w:bottom w:w="80" w:type="dxa"/>
+              <w:end w:w="120" w:type="dxa"/>
+            </w:tcMar>
+            <w:vAlign w:val="center"/>
+          </w:tcPr>
+          <w:p>
+            <w:pPr>
+              <w:jc w:val="center"/>
+            </w:pPr>
+            <w:r>
+              <w:rPr>
+                <w:rFonts w:ascii="Calibri" w:hAnsi="Calibri"/>
+                <w:color w:val="111827"/>
+                <w:sz w:val="17"/>
+              </w:rPr>
+              <w:t>0.00%</w:t>
+            </w:r>
+          </w:p>
+        </w:tc>
+        <w:tc>
+          <w:tcPr>
+            <w:tcW w:type="dxa" w:w="1235"/>
+            <w:tcMar>
+              <w:top w:w="80" w:type="dxa"/>
+              <w:start w:w="120" w:type="dxa"/>
+              <w:bottom w:w="80" w:type="dxa"/>
+              <w:end w:w="120" w:type="dxa"/>
+            </w:tcMar>
+            <w:vAlign w:val="center"/>
+          </w:tcPr>
+          <w:p>
+            <w:pPr>
+              <w:jc w:val="center"/>
+            </w:pPr>
+            <w:r>
+              <w:rPr>
+                <w:rFonts w:ascii="Calibri" w:hAnsi="Calibri"/>
+                <w:color w:val="111827"/>
+                <w:sz w:val="17"/>
+              </w:rPr>
+              <w:t>0.00%</w:t>
+            </w:r>
+          </w:p>
+        </w:tc>
+        <w:tc>
+          <w:tcPr>
+            <w:tcW w:type="dxa" w:w="1235"/>
+            <w:tcMar>
+              <w:top w:w="80" w:type="dxa"/>
+              <w:start w:w="120" w:type="dxa"/>
+              <w:bottom w:w="80" w:type="dxa"/>
+              <w:end w:w="120" w:type="dxa"/>
+            </w:tcMar>
+            <w:vAlign w:val="center"/>
+          </w:tcPr>
+          <w:p>
+            <w:pPr>
+              <w:jc w:val="center"/>
+            </w:pPr>
+            <w:r>
+              <w:rPr>
+                <w:rFonts w:ascii="Calibri" w:hAnsi="Calibri"/>
+                <w:color w:val="111827"/>
+                <w:sz w:val="17"/>
+              </w:rPr>
+              <w:t>100.00%</w:t>
+            </w:r>
+          </w:p>
+        </w:tc>
+        <w:tc>
+          <w:tcPr>
+            <w:tcW w:type="dxa" w:w="1235"/>
+            <w:tcMar>
+              <w:top w:w="80" w:type="dxa"/>
+              <w:start w:w="120" w:type="dxa"/>
+              <w:bottom w:w="80" w:type="dxa"/>
+              <w:end w:w="120" w:type="dxa"/>
+            </w:tcMar>
+            <w:vAlign w:val="center"/>
+          </w:tcPr>
+          <w:p>
+            <w:pPr>
+              <w:jc w:val="center"/>
+            </w:pPr>
+            <w:r>
+              <w:rPr>
+                <w:rFonts w:ascii="Calibri" w:hAnsi="Calibri"/>
+                <w:color w:val="111827"/>
+                <w:sz w:val="17"/>
+              </w:rPr>
+              <w:t>0.00%</w:t>
+            </w:r>
+          </w:p>
+        </w:tc>
+        <w:tc>
+          <w:tcPr>
+            <w:tcW w:type="dxa" w:w="1235"/>
+            <w:tcMar>
+              <w:top w:w="80" w:type="dxa"/>
+              <w:start w:w="120" w:type="dxa"/>
+              <w:bottom w:w="80" w:type="dxa"/>
+              <w:end w:w="120" w:type="dxa"/>
+            </w:tcMar>
+            <w:vAlign w:val="center"/>
+          </w:tcPr>
+          <w:p>
+            <w:pPr>
+              <w:jc w:val="center"/>
+            </w:pPr>
+            <w:r>
+              <w:rPr>
+                <w:rFonts w:ascii="Calibri" w:hAnsi="Calibri"/>
+                <w:color w:val="111827"/>
+                <w:sz w:val="17"/>
+              </w:rPr>
+              <w:t>1.00</w:t>
+            </w:r>
+          </w:p>
+        </w:tc>
+        <w:tc>
+          <w:tcPr>
+            <w:tcW w:type="dxa" w:w="1235"/>
+            <w:tcMar>
+              <w:top w:w="80" w:type="dxa"/>
+              <w:start w:w="120" w:type="dxa"/>
+              <w:bottom w:w="80" w:type="dxa"/>
+              <w:end w:w="120" w:type="dxa"/>
+            </w:tcMar>
+            <w:vAlign w:val="center"/>
+          </w:tcPr>
+          <w:p>
+            <w:pPr>
+              <w:jc w:val="center"/>
+            </w:pPr>
+            <w:r>
+              <w:rPr>
+                <w:rFonts w:ascii="Calibri" w:hAnsi="Calibri"/>
+                <w:color w:val="111827"/>
+                <w:sz w:val="17"/>
+              </w:rPr>
+              <w:t>yes</w:t>
+            </w:r>
+          </w:p>
+        </w:tc>
+      </w:tr>
+      <w:tr>
+        <w:tc>
+          <w:tcPr>
+            <w:tcW w:type="dxa" w:w="1235"/>
+            <w:tcMar>
+              <w:top w:w="80" w:type="dxa"/>
+              <w:start w:w="120" w:type="dxa"/>
+              <w:bottom w:w="80" w:type="dxa"/>
+              <w:end w:w="120" w:type="dxa"/>
+            </w:tcMar>
+            <w:vAlign w:val="center"/>
+          </w:tcPr>
+          <w:p>
+            <w:pPr>
+              <w:jc w:val="center"/>
+            </w:pPr>
+            <w:r>
+              <w:rPr>
+                <w:rFonts w:ascii="Calibri" w:hAnsi="Calibri"/>
+                <w:color w:val="111827"/>
+                <w:sz w:val="17"/>
+              </w:rPr>
+              <w:t>0.55</w:t>
+            </w:r>
+          </w:p>
+        </w:tc>
+        <w:tc>
+          <w:tcPr>
+            <w:tcW w:type="dxa" w:w="1235"/>
+            <w:tcMar>
+              <w:top w:w="80" w:type="dxa"/>
+              <w:start w:w="120" w:type="dxa"/>
+              <w:bottom w:w="80" w:type="dxa"/>
+              <w:end w:w="120" w:type="dxa"/>
+            </w:tcMar>
+            <w:vAlign w:val="center"/>
+          </w:tcPr>
+          <w:p>
+            <w:pPr>
+              <w:jc w:val="center"/>
+            </w:pPr>
+            <w:r>
+              <w:rPr>
+                <w:rFonts w:ascii="Calibri" w:hAnsi="Calibri"/>
+                <w:color w:val="111827"/>
+                <w:sz w:val="17"/>
+              </w:rPr>
+              <w:t>0.12</w:t>
+            </w:r>
+          </w:p>
+        </w:tc>
+        <w:tc>
+          <w:tcPr>
+            <w:tcW w:type="dxa" w:w="1235"/>
+            <w:tcMar>
+              <w:top w:w="80" w:type="dxa"/>
+              <w:start w:w="120" w:type="dxa"/>
+              <w:bottom w:w="80" w:type="dxa"/>
+              <w:end w:w="120" w:type="dxa"/>
+            </w:tcMar>
+            <w:vAlign w:val="center"/>
+          </w:tcPr>
+          <w:p>
+            <w:pPr>
+              <w:jc w:val="center"/>
+            </w:pPr>
+            <w:r>
+              <w:rPr>
+                <w:rFonts w:ascii="Calibri" w:hAnsi="Calibri"/>
+                <w:color w:val="111827"/>
+                <w:sz w:val="17"/>
+              </w:rPr>
+              <w:t>0.00%</w:t>
+            </w:r>
+          </w:p>
+        </w:tc>
+        <w:tc>
+          <w:tcPr>
+            <w:tcW w:type="dxa" w:w="1235"/>
+            <w:tcMar>
+              <w:top w:w="80" w:type="dxa"/>
+              <w:start w:w="120" w:type="dxa"/>
+              <w:bottom w:w="80" w:type="dxa"/>
+              <w:end w:w="120" w:type="dxa"/>
+            </w:tcMar>
+            <w:vAlign w:val="center"/>
+          </w:tcPr>
+          <w:p>
+            <w:pPr>
+              <w:jc w:val="center"/>
+            </w:pPr>
+            <w:r>
+              <w:rPr>
+                <w:rFonts w:ascii="Calibri" w:hAnsi="Calibri"/>
+                <w:color w:val="111827"/>
+                <w:sz w:val="17"/>
+              </w:rPr>
+              <w:t>0.00%</w:t>
+            </w:r>
+          </w:p>
+        </w:tc>
+        <w:tc>
+          <w:tcPr>
+            <w:tcW w:type="dxa" w:w="1235"/>
+            <w:tcMar>
+              <w:top w:w="80" w:type="dxa"/>
+              <w:start w:w="120" w:type="dxa"/>
+              <w:bottom w:w="80" w:type="dxa"/>
+              <w:end w:w="120" w:type="dxa"/>
+            </w:tcMar>
+            <w:vAlign w:val="center"/>
+          </w:tcPr>
+          <w:p>
+            <w:pPr>
+              <w:jc w:val="center"/>
+            </w:pPr>
+            <w:r>
+              <w:rPr>
+                <w:rFonts w:ascii="Calibri" w:hAnsi="Calibri"/>
+                <w:color w:val="111827"/>
+                <w:sz w:val="17"/>
+              </w:rPr>
+              <w:t>100.00%</w:t>
+            </w:r>
+          </w:p>
+        </w:tc>
+        <w:tc>
+          <w:tcPr>
+            <w:tcW w:type="dxa" w:w="1235"/>
+            <w:tcMar>
+              <w:top w:w="80" w:type="dxa"/>
+              <w:start w:w="120" w:type="dxa"/>
+              <w:bottom w:w="80" w:type="dxa"/>
+              <w:end w:w="120" w:type="dxa"/>
+            </w:tcMar>
+            <w:vAlign w:val="center"/>
+          </w:tcPr>
+          <w:p>
+            <w:pPr>
+              <w:jc w:val="center"/>
+            </w:pPr>
+            <w:r>
+              <w:rPr>
+                <w:rFonts w:ascii="Calibri" w:hAnsi="Calibri"/>
+                <w:color w:val="111827"/>
+                <w:sz w:val="17"/>
+              </w:rPr>
+              <w:t>0.00%</w:t>
+            </w:r>
+          </w:p>
+        </w:tc>
+        <w:tc>
+          <w:tcPr>
+            <w:tcW w:type="dxa" w:w="1235"/>
+            <w:tcMar>
+              <w:top w:w="80" w:type="dxa"/>
+              <w:start w:w="120" w:type="dxa"/>
+              <w:bottom w:w="80" w:type="dxa"/>
+              <w:end w:w="120" w:type="dxa"/>
+            </w:tcMar>
+            <w:vAlign w:val="center"/>
+          </w:tcPr>
+          <w:p>
+            <w:pPr>
+              <w:jc w:val="center"/>
+            </w:pPr>
+            <w:r>
+              <w:rPr>
+                <w:rFonts w:ascii="Calibri" w:hAnsi="Calibri"/>
+                <w:color w:val="111827"/>
+                <w:sz w:val="17"/>
+              </w:rPr>
+              <w:t>1.00</w:t>
+            </w:r>
+          </w:p>
+        </w:tc>
+        <w:tc>
+          <w:tcPr>
+            <w:tcW w:type="dxa" w:w="1235"/>
+            <w:tcMar>
+              <w:top w:w="80" w:type="dxa"/>
+              <w:start w:w="120" w:type="dxa"/>
+              <w:bottom w:w="80" w:type="dxa"/>
+              <w:end w:w="120" w:type="dxa"/>
+            </w:tcMar>
+            <w:vAlign w:val="center"/>
+          </w:tcPr>
+          <w:p>
+            <w:pPr>
+              <w:jc w:val="center"/>
+            </w:pPr>
+            <w:r>
+              <w:rPr>
+                <w:rFonts w:ascii="Calibri" w:hAnsi="Calibri"/>
+                <w:color w:val="111827"/>
+                <w:sz w:val="17"/>
+              </w:rPr>
+              <w:t>no</w:t>
+            </w:r>
+          </w:p>
+        </w:tc>
+      </w:tr>
+      <w:tr>
+        <w:tc>
+          <w:tcPr>
+            <w:tcW w:type="dxa" w:w="1235"/>
+            <w:tcMar>
+              <w:top w:w="80" w:type="dxa"/>
+              <w:start w:w="120" w:type="dxa"/>
+              <w:bottom w:w="80" w:type="dxa"/>
+              <w:end w:w="120" w:type="dxa"/>
+            </w:tcMar>
+            <w:vAlign w:val="center"/>
+          </w:tcPr>
+          <w:p>
+            <w:pPr>
+              <w:jc w:val="center"/>
+            </w:pPr>
+            <w:r>
+              <w:rPr>
+                <w:rFonts w:ascii="Calibri" w:hAnsi="Calibri"/>
+                <w:color w:val="111827"/>
+                <w:sz w:val="17"/>
+              </w:rPr>
+              <w:t>0.70</w:t>
+            </w:r>
+          </w:p>
+        </w:tc>
+        <w:tc>
+          <w:tcPr>
+            <w:tcW w:type="dxa" w:w="1235"/>
+            <w:tcMar>
+              <w:top w:w="80" w:type="dxa"/>
+              <w:start w:w="120" w:type="dxa"/>
+              <w:bottom w:w="80" w:type="dxa"/>
+              <w:end w:w="120" w:type="dxa"/>
+            </w:tcMar>
+            <w:vAlign w:val="center"/>
+          </w:tcPr>
+          <w:p>
+            <w:pPr>
+              <w:jc w:val="center"/>
+            </w:pPr>
+            <w:r>
+              <w:rPr>
+                <w:rFonts w:ascii="Calibri" w:hAnsi="Calibri"/>
+                <w:color w:val="111827"/>
+                <w:sz w:val="17"/>
+              </w:rPr>
+              <w:t>0.12</w:t>
+            </w:r>
+          </w:p>
+        </w:tc>
+        <w:tc>
+          <w:tcPr>
+            <w:tcW w:type="dxa" w:w="1235"/>
+            <w:tcMar>
+              <w:top w:w="80" w:type="dxa"/>
+              <w:start w:w="120" w:type="dxa"/>
+              <w:bottom w:w="80" w:type="dxa"/>
+              <w:end w:w="120" w:type="dxa"/>
+            </w:tcMar>
+            <w:vAlign w:val="center"/>
+          </w:tcPr>
+          <w:p>
+            <w:pPr>
+              <w:jc w:val="center"/>
+            </w:pPr>
+            <w:r>
+              <w:rPr>
+                <w:rFonts w:ascii="Calibri" w:hAnsi="Calibri"/>
+                <w:color w:val="111827"/>
+                <w:sz w:val="17"/>
+              </w:rPr>
+              <w:t>0.00%</w:t>
+            </w:r>
+          </w:p>
+        </w:tc>
+        <w:tc>
+          <w:tcPr>
+            <w:tcW w:type="dxa" w:w="1235"/>
+            <w:tcMar>
+              <w:top w:w="80" w:type="dxa"/>
+              <w:start w:w="120" w:type="dxa"/>
+              <w:bottom w:w="80" w:type="dxa"/>
+              <w:end w:w="120" w:type="dxa"/>
+            </w:tcMar>
+            <w:vAlign w:val="center"/>
+          </w:tcPr>
+          <w:p>
+            <w:pPr>
+              <w:jc w:val="center"/>
+            </w:pPr>
+            <w:r>
+              <w:rPr>
+                <w:rFonts w:ascii="Calibri" w:hAnsi="Calibri"/>
+                <w:color w:val="111827"/>
+                <w:sz w:val="17"/>
+              </w:rPr>
+              <w:t>0.00%</w:t>
+            </w:r>
+          </w:p>
+        </w:tc>
+        <w:tc>
+          <w:tcPr>
+            <w:tcW w:type="dxa" w:w="1235"/>
+            <w:tcMar>
+              <w:top w:w="80" w:type="dxa"/>
+              <w:start w:w="120" w:type="dxa"/>
+              <w:bottom w:w="80" w:type="dxa"/>
+              <w:end w:w="120" w:type="dxa"/>
+            </w:tcMar>
+            <w:vAlign w:val="center"/>
+          </w:tcPr>
+          <w:p>
+            <w:pPr>
+              <w:jc w:val="center"/>
+            </w:pPr>
+            <w:r>
+              <w:rPr>
+                <w:rFonts w:ascii="Calibri" w:hAnsi="Calibri"/>
+                <w:color w:val="111827"/>
+                <w:sz w:val="17"/>
+              </w:rPr>
+              <w:t>100.00%</w:t>
+            </w:r>
+          </w:p>
+        </w:tc>
+        <w:tc>
+          <w:tcPr>
+            <w:tcW w:type="dxa" w:w="1235"/>
+            <w:tcMar>
+              <w:top w:w="80" w:type="dxa"/>
+              <w:start w:w="120" w:type="dxa"/>
+              <w:bottom w:w="80" w:type="dxa"/>
+              <w:end w:w="120" w:type="dxa"/>
+            </w:tcMar>
+            <w:vAlign w:val="center"/>
+          </w:tcPr>
+          <w:p>
+            <w:pPr>
+              <w:jc w:val="center"/>
+            </w:pPr>
+            <w:r>
+              <w:rPr>
+                <w:rFonts w:ascii="Calibri" w:hAnsi="Calibri"/>
+                <w:color w:val="111827"/>
+                <w:sz w:val="17"/>
+              </w:rPr>
+              <w:t>0.00%</w:t>
+            </w:r>
+          </w:p>
+        </w:tc>
+        <w:tc>
+          <w:tcPr>
+            <w:tcW w:type="dxa" w:w="1235"/>
+            <w:tcMar>
+              <w:top w:w="80" w:type="dxa"/>
+              <w:start w:w="120" w:type="dxa"/>
+              <w:bottom w:w="80" w:type="dxa"/>
+              <w:end w:w="120" w:type="dxa"/>
+            </w:tcMar>
+            <w:vAlign w:val="center"/>
+          </w:tcPr>
+          <w:p>
+            <w:pPr>
+              <w:jc w:val="center"/>
+            </w:pPr>
+            <w:r>
+              <w:rPr>
+                <w:rFonts w:ascii="Calibri" w:hAnsi="Calibri"/>
+                <w:color w:val="111827"/>
+                <w:sz w:val="17"/>
+              </w:rPr>
+              <w:t>1.00</w:t>
+            </w:r>
+          </w:p>
+        </w:tc>
+        <w:tc>
+          <w:tcPr>
+            <w:tcW w:type="dxa" w:w="1235"/>
+            <w:tcMar>
+              <w:top w:w="80" w:type="dxa"/>
+              <w:start w:w="120" w:type="dxa"/>
+              <w:bottom w:w="80" w:type="dxa"/>
+              <w:end w:w="120" w:type="dxa"/>
+            </w:tcMar>
+            <w:vAlign w:val="center"/>
+          </w:tcPr>
+          <w:p>
+            <w:pPr>
+              <w:jc w:val="center"/>
+            </w:pPr>
+            <w:r>
+              <w:rPr>
+                <w:rFonts w:ascii="Calibri" w:hAnsi="Calibri"/>
+                <w:color w:val="111827"/>
+                <w:sz w:val="17"/>
+              </w:rPr>
+              <w:t>no</w:t>
+            </w:r>
+          </w:p>
+        </w:tc>
+      </w:tr>
+      <w:tr>
+        <w:tc>
+          <w:tcPr>
+            <w:tcW w:type="dxa" w:w="1235"/>
+            <w:tcMar>
+              <w:top w:w="80" w:type="dxa"/>
+              <w:start w:w="120" w:type="dxa"/>
+              <w:bottom w:w="80" w:type="dxa"/>
+              <w:end w:w="120" w:type="dxa"/>
+            </w:tcMar>
+            <w:vAlign w:val="center"/>
+          </w:tcPr>
+          <w:p>
+            <w:pPr>
+              <w:jc w:val="center"/>
+            </w:pPr>
+            <w:r>
+              <w:rPr>
+                <w:rFonts w:ascii="Calibri" w:hAnsi="Calibri"/>
+                <w:color w:val="111827"/>
+                <w:sz w:val="17"/>
+              </w:rPr>
+              <w:t>0.85</w:t>
+            </w:r>
+          </w:p>
+        </w:tc>
+        <w:tc>
+          <w:tcPr>
+            <w:tcW w:type="dxa" w:w="1235"/>
+            <w:tcMar>
+              <w:top w:w="80" w:type="dxa"/>
+              <w:start w:w="120" w:type="dxa"/>
+              <w:bottom w:w="80" w:type="dxa"/>
+              <w:end w:w="120" w:type="dxa"/>
+            </w:tcMar>
+            <w:vAlign w:val="center"/>
+          </w:tcPr>
+          <w:p>
+            <w:pPr>
+              <w:jc w:val="center"/>
+            </w:pPr>
+            <w:r>
+              <w:rPr>
+                <w:rFonts w:ascii="Calibri" w:hAnsi="Calibri"/>
+                <w:color w:val="111827"/>
+                <w:sz w:val="17"/>
+              </w:rPr>
+              <w:t>0.24</w:t>
+            </w:r>
+          </w:p>
+        </w:tc>
+        <w:tc>
+          <w:tcPr>
+            <w:tcW w:type="dxa" w:w="1235"/>
+            <w:tcMar>
+              <w:top w:w="80" w:type="dxa"/>
+              <w:start w:w="120" w:type="dxa"/>
+              <w:bottom w:w="80" w:type="dxa"/>
+              <w:end w:w="120" w:type="dxa"/>
+            </w:tcMar>
+            <w:vAlign w:val="center"/>
+          </w:tcPr>
+          <w:p>
+            <w:pPr>
+              <w:jc w:val="center"/>
+            </w:pPr>
+            <w:r>
+              <w:rPr>
+                <w:rFonts w:ascii="Calibri" w:hAnsi="Calibri"/>
+                <w:color w:val="111827"/>
+                <w:sz w:val="17"/>
+              </w:rPr>
+              <w:t>0.00%</w:t>
+            </w:r>
+          </w:p>
+        </w:tc>
+        <w:tc>
+          <w:tcPr>
+            <w:tcW w:type="dxa" w:w="1235"/>
+            <w:tcMar>
+              <w:top w:w="80" w:type="dxa"/>
+              <w:start w:w="120" w:type="dxa"/>
+              <w:bottom w:w="80" w:type="dxa"/>
+              <w:end w:w="120" w:type="dxa"/>
+            </w:tcMar>
+            <w:vAlign w:val="center"/>
+          </w:tcPr>
+          <w:p>
+            <w:pPr>
+              <w:jc w:val="center"/>
+            </w:pPr>
+            <w:r>
+              <w:rPr>
+                <w:rFonts w:ascii="Calibri" w:hAnsi="Calibri"/>
+                <w:color w:val="111827"/>
+                <w:sz w:val="17"/>
+              </w:rPr>
+              <w:t>0.00%</w:t>
+            </w:r>
+          </w:p>
+        </w:tc>
+        <w:tc>
+          <w:tcPr>
+            <w:tcW w:type="dxa" w:w="1235"/>
+            <w:tcMar>
+              <w:top w:w="80" w:type="dxa"/>
+              <w:start w:w="120" w:type="dxa"/>
+              <w:bottom w:w="80" w:type="dxa"/>
+              <w:end w:w="120" w:type="dxa"/>
+            </w:tcMar>
+            <w:vAlign w:val="center"/>
+          </w:tcPr>
+          <w:p>
+            <w:pPr>
+              <w:jc w:val="center"/>
+            </w:pPr>
+            <w:r>
+              <w:rPr>
+                <w:rFonts w:ascii="Calibri" w:hAnsi="Calibri"/>
+                <w:color w:val="111827"/>
+                <w:sz w:val="17"/>
+              </w:rPr>
+              <w:t>100.00%</w:t>
+            </w:r>
+          </w:p>
+        </w:tc>
+        <w:tc>
+          <w:tcPr>
+            <w:tcW w:type="dxa" w:w="1235"/>
+            <w:tcMar>
+              <w:top w:w="80" w:type="dxa"/>
+              <w:start w:w="120" w:type="dxa"/>
+              <w:bottom w:w="80" w:type="dxa"/>
+              <w:end w:w="120" w:type="dxa"/>
+            </w:tcMar>
+            <w:vAlign w:val="center"/>
+          </w:tcPr>
+          <w:p>
+            <w:pPr>
+              <w:jc w:val="center"/>
+            </w:pPr>
+            <w:r>
+              <w:rPr>
+                <w:rFonts w:ascii="Calibri" w:hAnsi="Calibri"/>
+                <w:color w:val="111827"/>
+                <w:sz w:val="17"/>
+              </w:rPr>
+              <w:t>0.00%</w:t>
+            </w:r>
+          </w:p>
+        </w:tc>
+        <w:tc>
+          <w:tcPr>
+            <w:tcW w:type="dxa" w:w="1235"/>
+            <w:tcMar>
+              <w:top w:w="80" w:type="dxa"/>
+              <w:start w:w="120" w:type="dxa"/>
+              <w:bottom w:w="80" w:type="dxa"/>
+              <w:end w:w="120" w:type="dxa"/>
+            </w:tcMar>
+            <w:vAlign w:val="center"/>
+          </w:tcPr>
+          <w:p>
+            <w:pPr>
+              <w:jc w:val="center"/>
+            </w:pPr>
+            <w:r>
+              <w:rPr>
+                <w:rFonts w:ascii="Calibri" w:hAnsi="Calibri"/>
+                <w:color w:val="111827"/>
+                <w:sz w:val="17"/>
+              </w:rPr>
+              <w:t>1.00</w:t>
+            </w:r>
+          </w:p>
+        </w:tc>
+        <w:tc>
+          <w:tcPr>
+            <w:tcW w:type="dxa" w:w="1235"/>
+            <w:tcMar>
+              <w:top w:w="80" w:type="dxa"/>
+              <w:start w:w="120" w:type="dxa"/>
+              <w:bottom w:w="80" w:type="dxa"/>
+              <w:end w:w="120" w:type="dxa"/>
+            </w:tcMar>
+            <w:vAlign w:val="center"/>
+          </w:tcPr>
+          <w:p>
+            <w:pPr>
+              <w:jc w:val="center"/>
+            </w:pPr>
+            <w:r>
+              <w:rPr>
+                <w:rFonts w:ascii="Calibri" w:hAnsi="Calibri"/>
+                <w:color w:val="111827"/>
+                <w:sz w:val="17"/>
+              </w:rPr>
+              <w:t>no</w:t>
+            </w:r>
+          </w:p>
+        </w:tc>
+      </w:tr>
+    </w:tbl>
+    <w:p>
+      <w:pPr>
+        <w:spacing w:after="60"/>
+      </w:pPr>
+    </w:p>
+    <w:p>
+      <w:pPr>
+        <w:spacing w:after="120" w:line="264" w:lineRule="auto"/>
+      </w:pPr>
+      <w:r>
+        <w:rPr>
+          <w:rFonts w:ascii="Calibri" w:hAnsi="Calibri"/>
+          <w:color w:val="111827"/>
+          <w:sz w:val="21"/>
+        </w:rPr>
+        <w:t>A 16-point current-main sweep over medium-risk quorum and topic-scope thresholds found no ASR, risky-action, benign-accuracy, or false-positive degradation on the generated-holdout calibration setting. The exported calibration score combines security recall, benign precision, benign accuracy, risky-action rate, and false positives. This closes the prototype-level hand-tuning gap for the simulator, while the remaining research limitation is calibration on larger external benign and adversarial workloads.</w:t>
+      </w:r>
+    </w:p>
+    <w:p>
+      <w:pPr>
+        <w:pStyle w:val="Heading2"/>
+        <w:spacing w:before="180" w:after="100"/>
+      </w:pPr>
+      <w:r>
+        <w:rPr>
+          <w:rFonts w:ascii="Calibri" w:hAnsi="Calibri"/>
+          <w:b/>
+          <w:color w:val="0B2545"/>
+          <w:sz w:val="23"/>
+        </w:rPr>
+        <w:t>8.2 Live LLM Planner Check</w:t>
       </w:r>
     </w:p>
     <w:p>
@@ -7613,7 +8704,7 @@
           <w:color w:val="1F4D78"/>
           <w:sz w:val="19"/>
         </w:rPr>
-        <w:t>Table 9. Medium live LLM workflow-corpus run.</w:t>
+        <w:t>Table 10. Medium live LLM workflow-corpus run.</w:t>
       </w:r>
     </w:p>
     <w:tbl>
@@ -8207,7 +9298,7 @@
           <w:color w:val="1F4D78"/>
           <w:sz w:val="19"/>
         </w:rPr>
-        <w:t>Table 10. Defended medium live LLM result by model.</w:t>
+        <w:t>Table 11. Defended medium live LLM result by model.</w:t>
       </w:r>
     </w:p>
     <w:tbl>
@@ -8862,7 +9953,7 @@
           <w:color w:val="1F4D78"/>
           <w:sz w:val="19"/>
         </w:rPr>
-        <w:t>Table 11. High-cost local LLM smoke profile.</w:t>
+        <w:t>Table 12. High-cost local LLM smoke profile.</w:t>
       </w:r>
     </w:p>
     <w:tbl>
@@ -9428,7 +10519,7 @@
           <w:color w:val="0B2545"/>
           <w:sz w:val="23"/>
         </w:rPr>
-        <w:t>8.2 Gap-Closure Interpretation</w:t>
+        <w:t>8.3 Gap-Closure Interpretation</w:t>
       </w:r>
     </w:p>
     <w:p>
@@ -9442,7 +10533,7 @@
           <w:color w:val="1F4D78"/>
           <w:sz w:val="19"/>
         </w:rPr>
-        <w:t>Table 12. Why capsule authorization closes tested baseline failures.</w:t>
+        <w:t>Table 13. Why capsule authorization closes tested baseline failures.</w:t>
       </w:r>
     </w:p>
     <w:tbl>
@@ -10097,7 +11188,7 @@
           <w:color w:val="0B2545"/>
           <w:sz w:val="23"/>
         </w:rPr>
-        <w:t>8.3 Security Argument</w:t>
+        <w:t>8.4 Security Argument</w:t>
       </w:r>
     </w:p>
     <w:p>
@@ -10290,7 +11381,7 @@
           <w:color w:val="111827"/>
           <w:sz w:val="20"/>
         </w:rPr>
-        <w:t>Policy thresholds are hand-tuned research parameters and require workload calibration.</w:t>
+        <w:t>The current draft includes simulator threshold calibration, but production thresholds still require external benign and adversarial workload calibration.</w:t>
       </w:r>
     </w:p>
     <w:p>
@@ -10403,7 +11494,7 @@
           <w:color w:val="111827"/>
           <w:sz w:val="20"/>
         </w:rPr>
-        <w:t>Calibrate thresholds on benign production workloads before using them as deployment policy.</w:t>
+        <w:t>Extend threshold calibration to external benign production-like workloads before using it as deployment policy.</w:t>
       </w:r>
     </w:p>
     <w:p>
@@ -10716,7 +11807,7 @@
                 <w:color w:val="111827"/>
                 <w:sz w:val="17"/>
               </w:rPr>
-              <w:t>Branch: fix/llm-first-pass-json-planning</w:t>
+              <w:t>Branch: main</w:t>
             </w:r>
             <w:r>
               <w:br/>
@@ -10727,7 +11818,7 @@
                 <w:color w:val="111827"/>
                 <w:sz w:val="17"/>
               </w:rPr>
-              <w:t>Commit: ac1d2ea</w:t>
+              <w:t>Commit: latest pushed main commit</w:t>
             </w:r>
             <w:r>
               <w:br/>
@@ -10759,7 +11850,7 @@
                 <w:color w:val="111827"/>
                 <w:sz w:val="17"/>
               </w:rPr>
-              <w:t># Expected current result: Ran 142 tests, OK</w:t>
+              <w:t># Expected current result: Ran 147 tests, OK</w:t>
             </w:r>
             <w:r>
               <w:br/>
@@ -10802,6 +11893,27 @@
                 <w:sz w:val="17"/>
               </w:rPr>
               <w:t>python run_capsuleguard.py --attack-mode trace_corpus --workflow-corpus data/agent_trace_corpus_sample.jsonl --summary-csv results/trace_corpus_sample_summary.csv --trace-jsonl results/trace_corpus_sample_traces.jsonl --breakdown-csv results/trace_corpus_sample_breakdown.csv --gap-closure-csv results/trace_corpus_sample_gap_closure.csv --tool-trace-csv results/trace_corpus_sample_tool_traces.csv --charts-dir results/trace_corpus_sample_charts</w:t>
+            </w:r>
+            <w:r>
+              <w:br/>
+            </w:r>
+            <w:r>
+              <w:rPr>
+                <w:rFonts w:ascii="Consolas" w:hAnsi="Consolas"/>
+                <w:color w:val="111827"/>
+                <w:sz w:val="17"/>
+              </w:rPr>
+            </w:r>
+            <w:r>
+              <w:br/>
+            </w:r>
+            <w:r>
+              <w:rPr>
+                <w:rFonts w:ascii="Consolas" w:hAnsi="Consolas"/>
+                <w:color w:val="111827"/>
+                <w:sz w:val="17"/>
+              </w:rPr>
+              <w:t>python run_sensitivity.py --attack-mode generated_holdout --repetitions 4 --noise-memories 8 --seed 2026 --medium-thresholds 0.45,0.55,0.70,0.85 --topic-thresholds 0.08,0.12,0.18,0.24 --csv results/current_main_threshold_calibration.csv --charts-dir results/current_main_threshold_calibration_charts</w:t>
             </w:r>
             <w:r>
               <w:br/>

</xml_diff>

<commit_message>
docs(paper): add formal threat model
</commit_message>
<xml_diff>
--- a/paper/Intent_Bound_Memory_Capsules_Submission_Draft_v2.docx
+++ b/paper/Intent_Bound_Memory_Capsules_Submission_Draft_v2.docx
@@ -1427,7 +1427,967 @@
           <w:color w:val="111827"/>
           <w:sz w:val="21"/>
         </w:rPr>
-        <w:t>The attacker may influence memories through web content, OCR-extracted text, tool output, agent-generated summaries, experience logs, query-only interaction, delayed triggers, semantic paraphrases, retrieval collisions, or trusted-looking but unattested metadata. The attacker tries to cause a future query to retrieve and act on the poisoned memory.</w:t>
+        <w:t>The adversary is a memory-poisoning attacker, not a code-execution attacker. The attacker can cause untrusted or weakly trusted content to enter the agent's memory lifecycle, wait for that content to be retrieved in a later task, and attempt to turn retrieved data into planning authority.</w:t>
+      </w:r>
+    </w:p>
+    <w:p>
+      <w:pPr>
+        <w:spacing w:before="100" w:after="80"/>
+      </w:pPr>
+      <w:r>
+        <w:rPr>
+          <w:rFonts w:ascii="Calibri" w:hAnsi="Calibri"/>
+          <w:b/>
+          <w:color w:val="1F4D78"/>
+          <w:sz w:val="19"/>
+        </w:rPr>
+        <w:t>Table 2. Formal attacker capabilities and limits.</w:t>
+      </w:r>
+    </w:p>
+    <w:tbl>
+      <w:tblPr>
+        <w:tblStyle w:val="TableGrid"/>
+        <w:tblW w:type="auto" w:w="0"/>
+        <w:tblLook w:firstColumn="1" w:firstRow="1" w:lastColumn="0" w:lastRow="0" w:noHBand="0" w:noVBand="1" w:val="04A0"/>
+        <w:tblLayout w:type="fixed"/>
+      </w:tblPr>
+      <w:tblGrid>
+        <w:gridCol w:w="3293"/>
+        <w:gridCol w:w="3293"/>
+        <w:gridCol w:w="3293"/>
+      </w:tblGrid>
+      <w:tr>
+        <w:tc>
+          <w:tcPr>
+            <w:tcW w:type="dxa" w:w="3293"/>
+            <w:shd w:fill="F2F4F7"/>
+            <w:tcMar>
+              <w:top w:w="80" w:type="dxa"/>
+              <w:start w:w="120" w:type="dxa"/>
+              <w:bottom w:w="80" w:type="dxa"/>
+              <w:end w:w="120" w:type="dxa"/>
+            </w:tcMar>
+            <w:vAlign w:val="center"/>
+          </w:tcPr>
+          <w:p>
+            <w:pPr>
+              <w:jc w:val="center"/>
+            </w:pPr>
+            <w:r>
+              <w:rPr>
+                <w:rFonts w:ascii="Calibri" w:hAnsi="Calibri"/>
+                <w:b/>
+                <w:color w:val="0B2545"/>
+                <w:sz w:val="17"/>
+              </w:rPr>
+              <w:t>Capability</w:t>
+            </w:r>
+          </w:p>
+        </w:tc>
+        <w:tc>
+          <w:tcPr>
+            <w:tcW w:type="dxa" w:w="3293"/>
+            <w:shd w:fill="F2F4F7"/>
+            <w:tcMar>
+              <w:top w:w="80" w:type="dxa"/>
+              <w:start w:w="120" w:type="dxa"/>
+              <w:bottom w:w="80" w:type="dxa"/>
+              <w:end w:w="120" w:type="dxa"/>
+            </w:tcMar>
+            <w:vAlign w:val="center"/>
+          </w:tcPr>
+          <w:p>
+            <w:pPr>
+              <w:jc w:val="center"/>
+            </w:pPr>
+            <w:r>
+              <w:rPr>
+                <w:rFonts w:ascii="Calibri" w:hAnsi="Calibri"/>
+                <w:b/>
+                <w:color w:val="0B2545"/>
+                <w:sz w:val="17"/>
+              </w:rPr>
+              <w:t>In scope</w:t>
+            </w:r>
+          </w:p>
+        </w:tc>
+        <w:tc>
+          <w:tcPr>
+            <w:tcW w:type="dxa" w:w="3293"/>
+            <w:shd w:fill="F2F4F7"/>
+            <w:tcMar>
+              <w:top w:w="80" w:type="dxa"/>
+              <w:start w:w="120" w:type="dxa"/>
+              <w:bottom w:w="80" w:type="dxa"/>
+              <w:end w:w="120" w:type="dxa"/>
+            </w:tcMar>
+            <w:vAlign w:val="center"/>
+          </w:tcPr>
+          <w:p>
+            <w:pPr>
+              <w:jc w:val="center"/>
+            </w:pPr>
+            <w:r>
+              <w:rPr>
+                <w:rFonts w:ascii="Calibri" w:hAnsi="Calibri"/>
+                <w:b/>
+                <w:color w:val="0B2545"/>
+                <w:sz w:val="17"/>
+              </w:rPr>
+              <w:t>Explicit limit</w:t>
+            </w:r>
+          </w:p>
+        </w:tc>
+      </w:tr>
+      <w:tr>
+        <w:tc>
+          <w:tcPr>
+            <w:tcW w:type="dxa" w:w="3293"/>
+            <w:tcMar>
+              <w:top w:w="80" w:type="dxa"/>
+              <w:start w:w="120" w:type="dxa"/>
+              <w:bottom w:w="80" w:type="dxa"/>
+              <w:end w:w="120" w:type="dxa"/>
+            </w:tcMar>
+            <w:vAlign w:val="center"/>
+          </w:tcPr>
+          <w:p>
+            <w:pPr>
+              <w:jc w:val="center"/>
+            </w:pPr>
+            <w:r>
+              <w:rPr>
+                <w:rFonts w:ascii="Calibri" w:hAnsi="Calibri"/>
+                <w:color w:val="111827"/>
+                <w:sz w:val="17"/>
+              </w:rPr>
+              <w:t>Injection channel</w:t>
+            </w:r>
+          </w:p>
+        </w:tc>
+        <w:tc>
+          <w:tcPr>
+            <w:tcW w:type="dxa" w:w="3293"/>
+            <w:tcMar>
+              <w:top w:w="80" w:type="dxa"/>
+              <w:start w:w="120" w:type="dxa"/>
+              <w:bottom w:w="80" w:type="dxa"/>
+              <w:end w:w="120" w:type="dxa"/>
+            </w:tcMar>
+            <w:vAlign w:val="center"/>
+          </w:tcPr>
+          <w:p>
+            <w:pPr>
+              <w:jc w:val="left"/>
+            </w:pPr>
+            <w:r>
+              <w:rPr>
+                <w:rFonts w:ascii="Calibri" w:hAnsi="Calibri"/>
+                <w:color w:val="111827"/>
+                <w:sz w:val="17"/>
+              </w:rPr>
+              <w:t>The attacker can inject text through web pages, tool outputs, OCR-extracted documents, alt text, user-visible documents, experience logs, summaries, or memory import paths.</w:t>
+            </w:r>
+          </w:p>
+        </w:tc>
+        <w:tc>
+          <w:tcPr>
+            <w:tcW w:type="dxa" w:w="3293"/>
+            <w:tcMar>
+              <w:top w:w="80" w:type="dxa"/>
+              <w:start w:w="120" w:type="dxa"/>
+              <w:bottom w:w="80" w:type="dxa"/>
+              <w:end w:w="120" w:type="dxa"/>
+            </w:tcMar>
+            <w:vAlign w:val="center"/>
+          </w:tcPr>
+          <w:p>
+            <w:pPr>
+              <w:jc w:val="left"/>
+            </w:pPr>
+            <w:r>
+              <w:rPr>
+                <w:rFonts w:ascii="Calibri" w:hAnsi="Calibri"/>
+                <w:color w:val="111827"/>
+                <w:sz w:val="17"/>
+              </w:rPr>
+              <w:t>The attacker cannot directly edit system prompts, policy code, the capsule authorization gate, or benchmark labels.</w:t>
+            </w:r>
+          </w:p>
+        </w:tc>
+      </w:tr>
+      <w:tr>
+        <w:tc>
+          <w:tcPr>
+            <w:tcW w:type="dxa" w:w="3293"/>
+            <w:tcMar>
+              <w:top w:w="80" w:type="dxa"/>
+              <w:start w:w="120" w:type="dxa"/>
+              <w:bottom w:w="80" w:type="dxa"/>
+              <w:end w:w="120" w:type="dxa"/>
+            </w:tcMar>
+            <w:vAlign w:val="center"/>
+          </w:tcPr>
+          <w:p>
+            <w:pPr>
+              <w:jc w:val="center"/>
+            </w:pPr>
+            <w:r>
+              <w:rPr>
+                <w:rFonts w:ascii="Calibri" w:hAnsi="Calibri"/>
+                <w:color w:val="111827"/>
+                <w:sz w:val="17"/>
+              </w:rPr>
+              <w:t>Persistence</w:t>
+            </w:r>
+          </w:p>
+        </w:tc>
+        <w:tc>
+          <w:tcPr>
+            <w:tcW w:type="dxa" w:w="3293"/>
+            <w:tcMar>
+              <w:top w:w="80" w:type="dxa"/>
+              <w:start w:w="120" w:type="dxa"/>
+              <w:bottom w:w="80" w:type="dxa"/>
+              <w:end w:w="120" w:type="dxa"/>
+            </w:tcMar>
+            <w:vAlign w:val="center"/>
+          </w:tcPr>
+          <w:p>
+            <w:pPr>
+              <w:jc w:val="left"/>
+            </w:pPr>
+            <w:r>
+              <w:rPr>
+                <w:rFonts w:ascii="Calibri" w:hAnsi="Calibri"/>
+                <w:color w:val="111827"/>
+                <w:sz w:val="17"/>
+              </w:rPr>
+              <w:t>The attacker may create delayed-trigger or cross-session poison that is stored today and activated by a later user query.</w:t>
+            </w:r>
+          </w:p>
+        </w:tc>
+        <w:tc>
+          <w:tcPr>
+            <w:tcW w:type="dxa" w:w="3293"/>
+            <w:tcMar>
+              <w:top w:w="80" w:type="dxa"/>
+              <w:start w:w="120" w:type="dxa"/>
+              <w:bottom w:w="80" w:type="dxa"/>
+              <w:end w:w="120" w:type="dxa"/>
+            </w:tcMar>
+            <w:vAlign w:val="center"/>
+          </w:tcPr>
+          <w:p>
+            <w:pPr>
+              <w:jc w:val="left"/>
+            </w:pPr>
+            <w:r>
+              <w:rPr>
+                <w:rFonts w:ascii="Calibri" w:hAnsi="Calibri"/>
+                <w:color w:val="111827"/>
+                <w:sz w:val="17"/>
+              </w:rPr>
+              <w:t>The attacker cannot delete audit records or force the memory store to ignore capsule status transitions.</w:t>
+            </w:r>
+          </w:p>
+        </w:tc>
+      </w:tr>
+      <w:tr>
+        <w:tc>
+          <w:tcPr>
+            <w:tcW w:type="dxa" w:w="3293"/>
+            <w:tcMar>
+              <w:top w:w="80" w:type="dxa"/>
+              <w:start w:w="120" w:type="dxa"/>
+              <w:bottom w:w="80" w:type="dxa"/>
+              <w:end w:w="120" w:type="dxa"/>
+            </w:tcMar>
+            <w:vAlign w:val="center"/>
+          </w:tcPr>
+          <w:p>
+            <w:pPr>
+              <w:jc w:val="left"/>
+            </w:pPr>
+            <w:r>
+              <w:rPr>
+                <w:rFonts w:ascii="Calibri" w:hAnsi="Calibri"/>
+                <w:color w:val="111827"/>
+                <w:sz w:val="17"/>
+              </w:rPr>
+              <w:t>Semantic adaptation</w:t>
+            </w:r>
+          </w:p>
+        </w:tc>
+        <w:tc>
+          <w:tcPr>
+            <w:tcW w:type="dxa" w:w="3293"/>
+            <w:tcMar>
+              <w:top w:w="80" w:type="dxa"/>
+              <w:start w:w="120" w:type="dxa"/>
+              <w:bottom w:w="80" w:type="dxa"/>
+              <w:end w:w="120" w:type="dxa"/>
+            </w:tcMar>
+            <w:vAlign w:val="center"/>
+          </w:tcPr>
+          <w:p>
+            <w:pPr>
+              <w:jc w:val="left"/>
+            </w:pPr>
+            <w:r>
+              <w:rPr>
+                <w:rFonts w:ascii="Calibri" w:hAnsi="Calibri"/>
+                <w:color w:val="111827"/>
+                <w:sz w:val="17"/>
+              </w:rPr>
+              <w:t>The attacker may paraphrase instructions, split payloads across memories, use benign-looking wording, or craft retrieval-collision text.</w:t>
+            </w:r>
+          </w:p>
+        </w:tc>
+        <w:tc>
+          <w:tcPr>
+            <w:tcW w:type="dxa" w:w="3293"/>
+            <w:tcMar>
+              <w:top w:w="80" w:type="dxa"/>
+              <w:start w:w="120" w:type="dxa"/>
+              <w:bottom w:w="80" w:type="dxa"/>
+              <w:end w:w="120" w:type="dxa"/>
+            </w:tcMar>
+            <w:vAlign w:val="center"/>
+          </w:tcPr>
+          <w:p>
+            <w:pPr>
+              <w:jc w:val="left"/>
+            </w:pPr>
+            <w:r>
+              <w:rPr>
+                <w:rFonts w:ascii="Calibri" w:hAnsi="Calibri"/>
+                <w:color w:val="111827"/>
+                <w:sz w:val="17"/>
+              </w:rPr>
+              <w:t>The attacker cannot forge cryptographic provenance, verified-writer identity, or independent corroboration without compromising those systems.</w:t>
+            </w:r>
+          </w:p>
+        </w:tc>
+      </w:tr>
+      <w:tr>
+        <w:tc>
+          <w:tcPr>
+            <w:tcW w:type="dxa" w:w="3293"/>
+            <w:tcMar>
+              <w:top w:w="80" w:type="dxa"/>
+              <w:start w:w="120" w:type="dxa"/>
+              <w:bottom w:w="80" w:type="dxa"/>
+              <w:end w:w="120" w:type="dxa"/>
+            </w:tcMar>
+            <w:vAlign w:val="center"/>
+          </w:tcPr>
+          <w:p>
+            <w:pPr>
+              <w:jc w:val="left"/>
+            </w:pPr>
+            <w:r>
+              <w:rPr>
+                <w:rFonts w:ascii="Calibri" w:hAnsi="Calibri"/>
+                <w:color w:val="111827"/>
+                <w:sz w:val="17"/>
+              </w:rPr>
+              <w:t>Tool and OCR manipulation</w:t>
+            </w:r>
+          </w:p>
+        </w:tc>
+        <w:tc>
+          <w:tcPr>
+            <w:tcW w:type="dxa" w:w="3293"/>
+            <w:tcMar>
+              <w:top w:w="80" w:type="dxa"/>
+              <w:start w:w="120" w:type="dxa"/>
+              <w:bottom w:w="80" w:type="dxa"/>
+              <w:end w:w="120" w:type="dxa"/>
+            </w:tcMar>
+            <w:vAlign w:val="center"/>
+          </w:tcPr>
+          <w:p>
+            <w:pPr>
+              <w:jc w:val="left"/>
+            </w:pPr>
+            <w:r>
+              <w:rPr>
+                <w:rFonts w:ascii="Calibri" w:hAnsi="Calibri"/>
+                <w:color w:val="111827"/>
+                <w:sz w:val="17"/>
+              </w:rPr>
+              <w:t>The attacker may place malicious instructions inside tool-return text or OCR-visible content that the agent might summarize or store.</w:t>
+            </w:r>
+          </w:p>
+        </w:tc>
+        <w:tc>
+          <w:tcPr>
+            <w:tcW w:type="dxa" w:w="3293"/>
+            <w:tcMar>
+              <w:top w:w="80" w:type="dxa"/>
+              <w:start w:w="120" w:type="dxa"/>
+              <w:bottom w:w="80" w:type="dxa"/>
+              <w:end w:w="120" w:type="dxa"/>
+            </w:tcMar>
+            <w:vAlign w:val="center"/>
+          </w:tcPr>
+          <w:p>
+            <w:pPr>
+              <w:jc w:val="left"/>
+            </w:pPr>
+            <w:r>
+              <w:rPr>
+                <w:rFonts w:ascii="Calibri" w:hAnsi="Calibri"/>
+                <w:color w:val="111827"/>
+                <w:sz w:val="17"/>
+              </w:rPr>
+              <w:t>The attacker cannot directly compromise the tool runtime, OCR engine binary, or external service credentials.</w:t>
+            </w:r>
+          </w:p>
+        </w:tc>
+      </w:tr>
+      <w:tr>
+        <w:tc>
+          <w:tcPr>
+            <w:tcW w:type="dxa" w:w="3293"/>
+            <w:tcMar>
+              <w:top w:w="80" w:type="dxa"/>
+              <w:start w:w="120" w:type="dxa"/>
+              <w:bottom w:w="80" w:type="dxa"/>
+              <w:end w:w="120" w:type="dxa"/>
+            </w:tcMar>
+            <w:vAlign w:val="center"/>
+          </w:tcPr>
+          <w:p>
+            <w:pPr>
+              <w:jc w:val="center"/>
+            </w:pPr>
+            <w:r>
+              <w:rPr>
+                <w:rFonts w:ascii="Calibri" w:hAnsi="Calibri"/>
+                <w:color w:val="111827"/>
+                <w:sz w:val="17"/>
+              </w:rPr>
+              <w:t>Goal</w:t>
+            </w:r>
+          </w:p>
+        </w:tc>
+        <w:tc>
+          <w:tcPr>
+            <w:tcW w:type="dxa" w:w="3293"/>
+            <w:tcMar>
+              <w:top w:w="80" w:type="dxa"/>
+              <w:start w:w="120" w:type="dxa"/>
+              <w:bottom w:w="80" w:type="dxa"/>
+              <w:end w:w="120" w:type="dxa"/>
+            </w:tcMar>
+            <w:vAlign w:val="center"/>
+          </w:tcPr>
+          <w:p>
+            <w:pPr>
+              <w:jc w:val="left"/>
+            </w:pPr>
+            <w:r>
+              <w:rPr>
+                <w:rFonts w:ascii="Calibri" w:hAnsi="Calibri"/>
+                <w:color w:val="111827"/>
+                <w:sz w:val="17"/>
+              </w:rPr>
+              <w:t>The attacker aims to alter a recommendation, planning path, memory-derived preference, or medium/high-risk tool action toward an attacker-preferred outcome.</w:t>
+            </w:r>
+          </w:p>
+        </w:tc>
+        <w:tc>
+          <w:tcPr>
+            <w:tcW w:type="dxa" w:w="3293"/>
+            <w:tcMar>
+              <w:top w:w="80" w:type="dxa"/>
+              <w:start w:w="120" w:type="dxa"/>
+              <w:bottom w:w="80" w:type="dxa"/>
+              <w:end w:w="120" w:type="dxa"/>
+            </w:tcMar>
+            <w:vAlign w:val="center"/>
+          </w:tcPr>
+          <w:p>
+            <w:pPr>
+              <w:jc w:val="left"/>
+            </w:pPr>
+            <w:r>
+              <w:rPr>
+                <w:rFonts w:ascii="Calibri" w:hAnsi="Calibri"/>
+                <w:color w:val="111827"/>
+                <w:sz w:val="17"/>
+              </w:rPr>
+              <w:t>The attacker is not assumed to seek denial-of-service, model-weight compromise, or arbitrary host code execution in this prototype.</w:t>
+            </w:r>
+          </w:p>
+        </w:tc>
+      </w:tr>
+    </w:tbl>
+    <w:p>
+      <w:pPr>
+        <w:spacing w:after="60"/>
+      </w:pPr>
+    </w:p>
+    <w:p>
+      <w:pPr>
+        <w:pStyle w:val="Heading2"/>
+        <w:spacing w:before="180" w:after="100"/>
+      </w:pPr>
+      <w:r>
+        <w:rPr>
+          <w:rFonts w:ascii="Calibri" w:hAnsi="Calibri"/>
+          <w:b/>
+          <w:color w:val="0B2545"/>
+          <w:sz w:val="23"/>
+        </w:rPr>
+        <w:t>4.3 Trust Boundaries and Assumptions</w:t>
+      </w:r>
+    </w:p>
+    <w:p>
+      <w:pPr>
+        <w:spacing w:after="120" w:line="264" w:lineRule="auto"/>
+      </w:pPr>
+      <w:r>
+        <w:rPr>
+          <w:rFonts w:ascii="Calibri" w:hAnsi="Calibri"/>
+          <w:color w:val="111827"/>
+          <w:sz w:val="21"/>
+        </w:rPr>
+        <w:t>The core trust boundary is between retrieved memory as relevance evidence and retrieved memory as authority. The memory database, vector retriever, OCR pipeline, browser/tool outputs, and agent summaries are treated as partially untrusted inputs. The capsule compiler and policy gate are inside the trusted computing base for this prototype.</w:t>
+      </w:r>
+    </w:p>
+    <w:p>
+      <w:pPr>
+        <w:spacing w:before="100" w:after="80"/>
+      </w:pPr>
+      <w:r>
+        <w:rPr>
+          <w:rFonts w:ascii="Calibri" w:hAnsi="Calibri"/>
+          <w:b/>
+          <w:color w:val="1F4D78"/>
+          <w:sz w:val="19"/>
+        </w:rPr>
+        <w:t>Table 3. Threat-model assumptions.</w:t>
+      </w:r>
+    </w:p>
+    <w:tbl>
+      <w:tblPr>
+        <w:tblStyle w:val="TableGrid"/>
+        <w:tblW w:type="auto" w:w="0"/>
+        <w:tblLook w:firstColumn="1" w:firstRow="1" w:lastColumn="0" w:lastRow="0" w:noHBand="0" w:noVBand="1" w:val="04A0"/>
+        <w:tblLayout w:type="fixed"/>
+      </w:tblPr>
+      <w:tblGrid>
+        <w:gridCol w:w="4939"/>
+        <w:gridCol w:w="4939"/>
+      </w:tblGrid>
+      <w:tr>
+        <w:tc>
+          <w:tcPr>
+            <w:tcW w:type="dxa" w:w="4939"/>
+            <w:shd w:fill="F2F4F7"/>
+            <w:tcMar>
+              <w:top w:w="80" w:type="dxa"/>
+              <w:start w:w="120" w:type="dxa"/>
+              <w:bottom w:w="80" w:type="dxa"/>
+              <w:end w:w="120" w:type="dxa"/>
+            </w:tcMar>
+            <w:vAlign w:val="center"/>
+          </w:tcPr>
+          <w:p>
+            <w:pPr>
+              <w:jc w:val="center"/>
+            </w:pPr>
+            <w:r>
+              <w:rPr>
+                <w:rFonts w:ascii="Calibri" w:hAnsi="Calibri"/>
+                <w:b/>
+                <w:color w:val="0B2545"/>
+                <w:sz w:val="17"/>
+              </w:rPr>
+              <w:t>Assumption</w:t>
+            </w:r>
+          </w:p>
+        </w:tc>
+        <w:tc>
+          <w:tcPr>
+            <w:tcW w:type="dxa" w:w="4939"/>
+            <w:shd w:fill="F2F4F7"/>
+            <w:tcMar>
+              <w:top w:w="80" w:type="dxa"/>
+              <w:start w:w="120" w:type="dxa"/>
+              <w:bottom w:w="80" w:type="dxa"/>
+              <w:end w:w="120" w:type="dxa"/>
+            </w:tcMar>
+            <w:vAlign w:val="center"/>
+          </w:tcPr>
+          <w:p>
+            <w:pPr>
+              <w:jc w:val="center"/>
+            </w:pPr>
+            <w:r>
+              <w:rPr>
+                <w:rFonts w:ascii="Calibri" w:hAnsi="Calibri"/>
+                <w:b/>
+                <w:color w:val="0B2545"/>
+                <w:sz w:val="17"/>
+              </w:rPr>
+              <w:t>Reason</w:t>
+            </w:r>
+          </w:p>
+        </w:tc>
+      </w:tr>
+      <w:tr>
+        <w:tc>
+          <w:tcPr>
+            <w:tcW w:type="dxa" w:w="4939"/>
+            <w:tcMar>
+              <w:top w:w="80" w:type="dxa"/>
+              <w:start w:w="120" w:type="dxa"/>
+              <w:bottom w:w="80" w:type="dxa"/>
+              <w:end w:w="120" w:type="dxa"/>
+            </w:tcMar>
+            <w:vAlign w:val="center"/>
+          </w:tcPr>
+          <w:p>
+            <w:pPr>
+              <w:jc w:val="left"/>
+            </w:pPr>
+            <w:r>
+              <w:rPr>
+                <w:rFonts w:ascii="Calibri" w:hAnsi="Calibri"/>
+                <w:color w:val="111827"/>
+                <w:sz w:val="17"/>
+              </w:rPr>
+              <w:t>Policy code and capsule gate execute as implemented.</w:t>
+            </w:r>
+          </w:p>
+        </w:tc>
+        <w:tc>
+          <w:tcPr>
+            <w:tcW w:type="dxa" w:w="4939"/>
+            <w:tcMar>
+              <w:top w:w="80" w:type="dxa"/>
+              <w:start w:w="120" w:type="dxa"/>
+              <w:bottom w:w="80" w:type="dxa"/>
+              <w:end w:w="120" w:type="dxa"/>
+            </w:tcMar>
+            <w:vAlign w:val="center"/>
+          </w:tcPr>
+          <w:p>
+            <w:pPr>
+              <w:jc w:val="left"/>
+            </w:pPr>
+            <w:r>
+              <w:rPr>
+                <w:rFonts w:ascii="Calibri" w:hAnsi="Calibri"/>
+                <w:color w:val="111827"/>
+                <w:sz w:val="17"/>
+              </w:rPr>
+              <w:t>The paper evaluates memory authorization, not host compromise or malicious maintainers.</w:t>
+            </w:r>
+          </w:p>
+        </w:tc>
+      </w:tr>
+      <w:tr>
+        <w:tc>
+          <w:tcPr>
+            <w:tcW w:type="dxa" w:w="4939"/>
+            <w:tcMar>
+              <w:top w:w="80" w:type="dxa"/>
+              <w:start w:w="120" w:type="dxa"/>
+              <w:bottom w:w="80" w:type="dxa"/>
+              <w:end w:w="120" w:type="dxa"/>
+            </w:tcMar>
+            <w:vAlign w:val="center"/>
+          </w:tcPr>
+          <w:p>
+            <w:pPr>
+              <w:jc w:val="left"/>
+            </w:pPr>
+            <w:r>
+              <w:rPr>
+                <w:rFonts w:ascii="Calibri" w:hAnsi="Calibri"/>
+                <w:color w:val="111827"/>
+                <w:sz w:val="17"/>
+              </w:rPr>
+              <w:t>Source labels may be noisy, but cryptographic attestations and verified writers cannot be forged in-scope.</w:t>
+            </w:r>
+          </w:p>
+        </w:tc>
+        <w:tc>
+          <w:tcPr>
+            <w:tcW w:type="dxa" w:w="4939"/>
+            <w:tcMar>
+              <w:top w:w="80" w:type="dxa"/>
+              <w:start w:w="120" w:type="dxa"/>
+              <w:bottom w:w="80" w:type="dxa"/>
+              <w:end w:w="120" w:type="dxa"/>
+            </w:tcMar>
+            <w:vAlign w:val="center"/>
+          </w:tcPr>
+          <w:p>
+            <w:pPr>
+              <w:jc w:val="left"/>
+            </w:pPr>
+            <w:r>
+              <w:rPr>
+                <w:rFonts w:ascii="Calibri" w:hAnsi="Calibri"/>
+                <w:color w:val="111827"/>
+                <w:sz w:val="17"/>
+              </w:rPr>
+              <w:t>This lets the benchmark test provenance distrust while preserving a meaningful root of trust.</w:t>
+            </w:r>
+          </w:p>
+        </w:tc>
+      </w:tr>
+      <w:tr>
+        <w:tc>
+          <w:tcPr>
+            <w:tcW w:type="dxa" w:w="4939"/>
+            <w:tcMar>
+              <w:top w:w="80" w:type="dxa"/>
+              <w:start w:w="120" w:type="dxa"/>
+              <w:bottom w:w="80" w:type="dxa"/>
+              <w:end w:w="120" w:type="dxa"/>
+            </w:tcMar>
+            <w:vAlign w:val="center"/>
+          </w:tcPr>
+          <w:p>
+            <w:pPr>
+              <w:jc w:val="left"/>
+            </w:pPr>
+            <w:r>
+              <w:rPr>
+                <w:rFonts w:ascii="Calibri" w:hAnsi="Calibri"/>
+                <w:color w:val="111827"/>
+                <w:sz w:val="17"/>
+              </w:rPr>
+              <w:t>Similarity retrieval can return malicious memories.</w:t>
+            </w:r>
+          </w:p>
+        </w:tc>
+        <w:tc>
+          <w:tcPr>
+            <w:tcW w:type="dxa" w:w="4939"/>
+            <w:tcMar>
+              <w:top w:w="80" w:type="dxa"/>
+              <w:start w:w="120" w:type="dxa"/>
+              <w:bottom w:w="80" w:type="dxa"/>
+              <w:end w:w="120" w:type="dxa"/>
+            </w:tcMar>
+            <w:vAlign w:val="center"/>
+          </w:tcPr>
+          <w:p>
+            <w:pPr>
+              <w:jc w:val="left"/>
+            </w:pPr>
+            <w:r>
+              <w:rPr>
+                <w:rFonts w:ascii="Calibri" w:hAnsi="Calibri"/>
+                <w:color w:val="111827"/>
+                <w:sz w:val="17"/>
+              </w:rPr>
+              <w:t>The defense must not rely on vector retrieval being safe; retrieval is treated as candidate selection only.</w:t>
+            </w:r>
+          </w:p>
+        </w:tc>
+      </w:tr>
+      <w:tr>
+        <w:tc>
+          <w:tcPr>
+            <w:tcW w:type="dxa" w:w="4939"/>
+            <w:tcMar>
+              <w:top w:w="80" w:type="dxa"/>
+              <w:start w:w="120" w:type="dxa"/>
+              <w:bottom w:w="80" w:type="dxa"/>
+              <w:end w:w="120" w:type="dxa"/>
+            </w:tcMar>
+            <w:vAlign w:val="center"/>
+          </w:tcPr>
+          <w:p>
+            <w:pPr>
+              <w:jc w:val="left"/>
+            </w:pPr>
+            <w:r>
+              <w:rPr>
+                <w:rFonts w:ascii="Calibri" w:hAnsi="Calibri"/>
+                <w:color w:val="111827"/>
+                <w:sz w:val="17"/>
+              </w:rPr>
+              <w:t>The planner may be tempted by malicious context.</w:t>
+            </w:r>
+          </w:p>
+        </w:tc>
+        <w:tc>
+          <w:tcPr>
+            <w:tcW w:type="dxa" w:w="4939"/>
+            <w:tcMar>
+              <w:top w:w="80" w:type="dxa"/>
+              <w:start w:w="120" w:type="dxa"/>
+              <w:bottom w:w="80" w:type="dxa"/>
+              <w:end w:w="120" w:type="dxa"/>
+            </w:tcMar>
+            <w:vAlign w:val="center"/>
+          </w:tcPr>
+          <w:p>
+            <w:pPr>
+              <w:jc w:val="left"/>
+            </w:pPr>
+            <w:r>
+              <w:rPr>
+                <w:rFonts w:ascii="Calibri" w:hAnsi="Calibri"/>
+                <w:color w:val="111827"/>
+                <w:sz w:val="17"/>
+              </w:rPr>
+              <w:t>The evaluation separates planner influence from final action acceptance using poison influence rate and ASR.</w:t>
+            </w:r>
+          </w:p>
+        </w:tc>
+      </w:tr>
+      <w:tr>
+        <w:tc>
+          <w:tcPr>
+            <w:tcW w:type="dxa" w:w="4939"/>
+            <w:tcMar>
+              <w:top w:w="80" w:type="dxa"/>
+              <w:start w:w="120" w:type="dxa"/>
+              <w:bottom w:w="80" w:type="dxa"/>
+              <w:end w:w="120" w:type="dxa"/>
+            </w:tcMar>
+            <w:vAlign w:val="center"/>
+          </w:tcPr>
+          <w:p>
+            <w:pPr>
+              <w:jc w:val="left"/>
+            </w:pPr>
+            <w:r>
+              <w:rPr>
+                <w:rFonts w:ascii="Calibri" w:hAnsi="Calibri"/>
+                <w:color w:val="111827"/>
+                <w:sz w:val="17"/>
+              </w:rPr>
+              <w:t>High-impact actions require explicit authorization evidence.</w:t>
+            </w:r>
+          </w:p>
+        </w:tc>
+        <w:tc>
+          <w:tcPr>
+            <w:tcW w:type="dxa" w:w="4939"/>
+            <w:tcMar>
+              <w:top w:w="80" w:type="dxa"/>
+              <w:start w:w="120" w:type="dxa"/>
+              <w:bottom w:w="80" w:type="dxa"/>
+              <w:end w:w="120" w:type="dxa"/>
+            </w:tcMar>
+            <w:vAlign w:val="center"/>
+          </w:tcPr>
+          <w:p>
+            <w:pPr>
+              <w:jc w:val="left"/>
+            </w:pPr>
+            <w:r>
+              <w:rPr>
+                <w:rFonts w:ascii="Calibri" w:hAnsi="Calibri"/>
+                <w:color w:val="111827"/>
+                <w:sz w:val="17"/>
+              </w:rPr>
+              <w:t>This models least-privilege operation for email, purchase, deletion, data sharing, and tool-chain changes.</w:t>
+            </w:r>
+          </w:p>
+        </w:tc>
+      </w:tr>
+    </w:tbl>
+    <w:p>
+      <w:pPr>
+        <w:spacing w:after="60"/>
+      </w:pPr>
+    </w:p>
+    <w:p>
+      <w:pPr>
+        <w:pStyle w:val="Heading2"/>
+        <w:spacing w:before="180" w:after="100"/>
+      </w:pPr>
+      <w:r>
+        <w:rPr>
+          <w:rFonts w:ascii="Calibri" w:hAnsi="Calibri"/>
+          <w:b/>
+          <w:color w:val="0B2545"/>
+          <w:sz w:val="23"/>
+        </w:rPr>
+        <w:t>4.4 Security Objectives and Success Criteria</w:t>
+      </w:r>
+    </w:p>
+    <w:p>
+      <w:pPr>
+        <w:pStyle w:val="ListBullet"/>
+        <w:spacing w:after="80"/>
+      </w:pPr>
+      <w:r>
+        <w:rPr>
+          <w:rFonts w:ascii="Calibri" w:hAnsi="Calibri"/>
+          <w:color w:val="111827"/>
+          <w:sz w:val="20"/>
+        </w:rPr>
+        <w:t>Prevent unauthorized influence: poisoned memory should not be able to determine the selected recommendation, plan, or tool path.</w:t>
+      </w:r>
+    </w:p>
+    <w:p>
+      <w:pPr>
+        <w:pStyle w:val="ListBullet"/>
+        <w:spacing w:after="80"/>
+      </w:pPr>
+      <w:r>
+        <w:rPr>
+          <w:rFonts w:ascii="Calibri" w:hAnsi="Calibri"/>
+          <w:color w:val="111827"/>
+          <w:sz w:val="20"/>
+        </w:rPr>
+        <w:t>Prevent unsafe execution: poisoned memory should not cause medium/high-risk actions such as email, purchase, delete, transfer, or data sharing.</w:t>
+      </w:r>
+    </w:p>
+    <w:p>
+      <w:pPr>
+        <w:pStyle w:val="ListBullet"/>
+        <w:spacing w:after="80"/>
+      </w:pPr>
+      <w:r>
+        <w:rPr>
+          <w:rFonts w:ascii="Calibri" w:hAnsi="Calibri"/>
+          <w:color w:val="111827"/>
+          <w:sz w:val="20"/>
+        </w:rPr>
+        <w:t>Preserve benign utility: legitimate memories should still support normal personalization and task completion.</w:t>
+      </w:r>
+    </w:p>
+    <w:p>
+      <w:pPr>
+        <w:pStyle w:val="ListBullet"/>
+        <w:spacing w:after="80"/>
+      </w:pPr>
+      <w:r>
+        <w:rPr>
+          <w:rFonts w:ascii="Calibri" w:hAnsi="Calibri"/>
+          <w:color w:val="111827"/>
+          <w:sz w:val="20"/>
+        </w:rPr>
+        <w:t>Keep poisoning auditable: suspicious records should be sealed, rejected, or traceable rather than silently discarded.</w:t>
+      </w:r>
+    </w:p>
+    <w:p>
+      <w:pPr>
+        <w:pStyle w:val="ListBullet"/>
+        <w:spacing w:after="80"/>
+      </w:pPr>
+      <w:r>
+        <w:rPr>
+          <w:rFonts w:ascii="Calibri" w:hAnsi="Calibri"/>
+          <w:color w:val="111827"/>
+          <w:sz w:val="20"/>
+        </w:rPr>
+        <w:t>Expose late-blocking defenses: metrics should distinguish final output blocking from memory influence before the output gate.</w:t>
       </w:r>
     </w:p>
     <w:p>
@@ -1442,7 +2402,612 @@
           <w:color w:val="0B2545"/>
           <w:sz w:val="23"/>
         </w:rPr>
-        <w:t>4.3 Out-of-Scope Capabilities</w:t>
+        <w:t>4.5 STRIDE and OWASP LLM Mapping</w:t>
+      </w:r>
+    </w:p>
+    <w:p>
+      <w:pPr>
+        <w:spacing w:before="100" w:after="80"/>
+      </w:pPr>
+      <w:r>
+        <w:rPr>
+          <w:rFonts w:ascii="Calibri" w:hAnsi="Calibri"/>
+          <w:b/>
+          <w:color w:val="1F4D78"/>
+          <w:sz w:val="19"/>
+        </w:rPr>
+        <w:t>Table 4. Threat categories covered by the model.</w:t>
+      </w:r>
+    </w:p>
+    <w:tbl>
+      <w:tblPr>
+        <w:tblStyle w:val="TableGrid"/>
+        <w:tblW w:type="auto" w:w="0"/>
+        <w:tblLook w:firstColumn="1" w:firstRow="1" w:lastColumn="0" w:lastRow="0" w:noHBand="0" w:noVBand="1" w:val="04A0"/>
+        <w:tblLayout w:type="fixed"/>
+      </w:tblPr>
+      <w:tblGrid>
+        <w:gridCol w:w="3293"/>
+        <w:gridCol w:w="3293"/>
+        <w:gridCol w:w="3293"/>
+      </w:tblGrid>
+      <w:tr>
+        <w:tc>
+          <w:tcPr>
+            <w:tcW w:type="dxa" w:w="3293"/>
+            <w:shd w:fill="F2F4F7"/>
+            <w:tcMar>
+              <w:top w:w="80" w:type="dxa"/>
+              <w:start w:w="120" w:type="dxa"/>
+              <w:bottom w:w="80" w:type="dxa"/>
+              <w:end w:w="120" w:type="dxa"/>
+            </w:tcMar>
+            <w:vAlign w:val="center"/>
+          </w:tcPr>
+          <w:p>
+            <w:pPr>
+              <w:jc w:val="center"/>
+            </w:pPr>
+            <w:r>
+              <w:rPr>
+                <w:rFonts w:ascii="Calibri" w:hAnsi="Calibri"/>
+                <w:b/>
+                <w:color w:val="0B2545"/>
+                <w:sz w:val="17"/>
+              </w:rPr>
+              <w:t>Category</w:t>
+            </w:r>
+          </w:p>
+        </w:tc>
+        <w:tc>
+          <w:tcPr>
+            <w:tcW w:type="dxa" w:w="3293"/>
+            <w:shd w:fill="F2F4F7"/>
+            <w:tcMar>
+              <w:top w:w="80" w:type="dxa"/>
+              <w:start w:w="120" w:type="dxa"/>
+              <w:bottom w:w="80" w:type="dxa"/>
+              <w:end w:w="120" w:type="dxa"/>
+            </w:tcMar>
+            <w:vAlign w:val="center"/>
+          </w:tcPr>
+          <w:p>
+            <w:pPr>
+              <w:jc w:val="center"/>
+            </w:pPr>
+            <w:r>
+              <w:rPr>
+                <w:rFonts w:ascii="Calibri" w:hAnsi="Calibri"/>
+                <w:b/>
+                <w:color w:val="0B2545"/>
+                <w:sz w:val="17"/>
+              </w:rPr>
+              <w:t>Agent-memory threat</w:t>
+            </w:r>
+          </w:p>
+        </w:tc>
+        <w:tc>
+          <w:tcPr>
+            <w:tcW w:type="dxa" w:w="3293"/>
+            <w:shd w:fill="F2F4F7"/>
+            <w:tcMar>
+              <w:top w:w="80" w:type="dxa"/>
+              <w:start w:w="120" w:type="dxa"/>
+              <w:bottom w:w="80" w:type="dxa"/>
+              <w:end w:w="120" w:type="dxa"/>
+            </w:tcMar>
+            <w:vAlign w:val="center"/>
+          </w:tcPr>
+          <w:p>
+            <w:pPr>
+              <w:jc w:val="center"/>
+            </w:pPr>
+            <w:r>
+              <w:rPr>
+                <w:rFonts w:ascii="Calibri" w:hAnsi="Calibri"/>
+                <w:b/>
+                <w:color w:val="0B2545"/>
+                <w:sz w:val="17"/>
+              </w:rPr>
+              <w:t>Capsule control</w:t>
+            </w:r>
+          </w:p>
+        </w:tc>
+      </w:tr>
+      <w:tr>
+        <w:tc>
+          <w:tcPr>
+            <w:tcW w:type="dxa" w:w="3293"/>
+            <w:tcMar>
+              <w:top w:w="80" w:type="dxa"/>
+              <w:start w:w="120" w:type="dxa"/>
+              <w:bottom w:w="80" w:type="dxa"/>
+              <w:end w:w="120" w:type="dxa"/>
+            </w:tcMar>
+            <w:vAlign w:val="center"/>
+          </w:tcPr>
+          <w:p>
+            <w:pPr>
+              <w:jc w:val="center"/>
+            </w:pPr>
+            <w:r>
+              <w:rPr>
+                <w:rFonts w:ascii="Calibri" w:hAnsi="Calibri"/>
+                <w:color w:val="111827"/>
+                <w:sz w:val="17"/>
+              </w:rPr>
+              <w:t>Spoofing</w:t>
+            </w:r>
+          </w:p>
+        </w:tc>
+        <w:tc>
+          <w:tcPr>
+            <w:tcW w:type="dxa" w:w="3293"/>
+            <w:tcMar>
+              <w:top w:w="80" w:type="dxa"/>
+              <w:start w:w="120" w:type="dxa"/>
+              <w:bottom w:w="80" w:type="dxa"/>
+              <w:end w:w="120" w:type="dxa"/>
+            </w:tcMar>
+            <w:vAlign w:val="center"/>
+          </w:tcPr>
+          <w:p>
+            <w:pPr>
+              <w:jc w:val="left"/>
+            </w:pPr>
+            <w:r>
+              <w:rPr>
+                <w:rFonts w:ascii="Calibri" w:hAnsi="Calibri"/>
+                <w:color w:val="111827"/>
+                <w:sz w:val="17"/>
+              </w:rPr>
+              <w:t>Untrusted memory pretends to be user preference, verified experience, or trusted tool output.</w:t>
+            </w:r>
+          </w:p>
+        </w:tc>
+        <w:tc>
+          <w:tcPr>
+            <w:tcW w:type="dxa" w:w="3293"/>
+            <w:tcMar>
+              <w:top w:w="80" w:type="dxa"/>
+              <w:start w:w="120" w:type="dxa"/>
+              <w:bottom w:w="80" w:type="dxa"/>
+              <w:end w:w="120" w:type="dxa"/>
+            </w:tcMar>
+            <w:vAlign w:val="center"/>
+          </w:tcPr>
+          <w:p>
+            <w:pPr>
+              <w:jc w:val="left"/>
+            </w:pPr>
+            <w:r>
+              <w:rPr>
+                <w:rFonts w:ascii="Calibri" w:hAnsi="Calibri"/>
+                <w:color w:val="111827"/>
+                <w:sz w:val="17"/>
+              </w:rPr>
+              <w:t>Source authority, writer identity, verification count, and lineage checks.</w:t>
+            </w:r>
+          </w:p>
+        </w:tc>
+      </w:tr>
+      <w:tr>
+        <w:tc>
+          <w:tcPr>
+            <w:tcW w:type="dxa" w:w="3293"/>
+            <w:tcMar>
+              <w:top w:w="80" w:type="dxa"/>
+              <w:start w:w="120" w:type="dxa"/>
+              <w:bottom w:w="80" w:type="dxa"/>
+              <w:end w:w="120" w:type="dxa"/>
+            </w:tcMar>
+            <w:vAlign w:val="center"/>
+          </w:tcPr>
+          <w:p>
+            <w:pPr>
+              <w:jc w:val="center"/>
+            </w:pPr>
+            <w:r>
+              <w:rPr>
+                <w:rFonts w:ascii="Calibri" w:hAnsi="Calibri"/>
+                <w:color w:val="111827"/>
+                <w:sz w:val="17"/>
+              </w:rPr>
+              <w:t>Tampering</w:t>
+            </w:r>
+          </w:p>
+        </w:tc>
+        <w:tc>
+          <w:tcPr>
+            <w:tcW w:type="dxa" w:w="3293"/>
+            <w:tcMar>
+              <w:top w:w="80" w:type="dxa"/>
+              <w:start w:w="120" w:type="dxa"/>
+              <w:bottom w:w="80" w:type="dxa"/>
+              <w:end w:w="120" w:type="dxa"/>
+            </w:tcMar>
+            <w:vAlign w:val="center"/>
+          </w:tcPr>
+          <w:p>
+            <w:pPr>
+              <w:jc w:val="left"/>
+            </w:pPr>
+            <w:r>
+              <w:rPr>
+                <w:rFonts w:ascii="Calibri" w:hAnsi="Calibri"/>
+                <w:color w:val="111827"/>
+                <w:sz w:val="17"/>
+              </w:rPr>
+              <w:t>Stored memory, summaries, or derived experiences alter future planning context.</w:t>
+            </w:r>
+          </w:p>
+        </w:tc>
+        <w:tc>
+          <w:tcPr>
+            <w:tcW w:type="dxa" w:w="3293"/>
+            <w:tcMar>
+              <w:top w:w="80" w:type="dxa"/>
+              <w:start w:w="120" w:type="dxa"/>
+              <w:bottom w:w="80" w:type="dxa"/>
+              <w:end w:w="120" w:type="dxa"/>
+            </w:tcMar>
+            <w:vAlign w:val="center"/>
+          </w:tcPr>
+          <w:p>
+            <w:pPr>
+              <w:jc w:val="left"/>
+            </w:pPr>
+            <w:r>
+              <w:rPr>
+                <w:rFonts w:ascii="Calibri" w:hAnsi="Calibri"/>
+                <w:color w:val="111827"/>
+                <w:sz w:val="17"/>
+              </w:rPr>
+              <w:t>Append-only provenance, capsule status, denied actions, and parent authority caps.</w:t>
+            </w:r>
+          </w:p>
+        </w:tc>
+      </w:tr>
+      <w:tr>
+        <w:tc>
+          <w:tcPr>
+            <w:tcW w:type="dxa" w:w="3293"/>
+            <w:tcMar>
+              <w:top w:w="80" w:type="dxa"/>
+              <w:start w:w="120" w:type="dxa"/>
+              <w:bottom w:w="80" w:type="dxa"/>
+              <w:end w:w="120" w:type="dxa"/>
+            </w:tcMar>
+            <w:vAlign w:val="center"/>
+          </w:tcPr>
+          <w:p>
+            <w:pPr>
+              <w:jc w:val="center"/>
+            </w:pPr>
+            <w:r>
+              <w:rPr>
+                <w:rFonts w:ascii="Calibri" w:hAnsi="Calibri"/>
+                <w:color w:val="111827"/>
+                <w:sz w:val="17"/>
+              </w:rPr>
+              <w:t>Repudiation</w:t>
+            </w:r>
+          </w:p>
+        </w:tc>
+        <w:tc>
+          <w:tcPr>
+            <w:tcW w:type="dxa" w:w="3293"/>
+            <w:tcMar>
+              <w:top w:w="80" w:type="dxa"/>
+              <w:start w:w="120" w:type="dxa"/>
+              <w:bottom w:w="80" w:type="dxa"/>
+              <w:end w:w="120" w:type="dxa"/>
+            </w:tcMar>
+            <w:vAlign w:val="center"/>
+          </w:tcPr>
+          <w:p>
+            <w:pPr>
+              <w:jc w:val="left"/>
+            </w:pPr>
+            <w:r>
+              <w:rPr>
+                <w:rFonts w:ascii="Calibri" w:hAnsi="Calibri"/>
+                <w:color w:val="111827"/>
+                <w:sz w:val="17"/>
+              </w:rPr>
+              <w:t>The system cannot explain why a poisoned memory was used or blocked.</w:t>
+            </w:r>
+          </w:p>
+        </w:tc>
+        <w:tc>
+          <w:tcPr>
+            <w:tcW w:type="dxa" w:w="3293"/>
+            <w:tcMar>
+              <w:top w:w="80" w:type="dxa"/>
+              <w:start w:w="120" w:type="dxa"/>
+              <w:bottom w:w="80" w:type="dxa"/>
+              <w:end w:w="120" w:type="dxa"/>
+            </w:tcMar>
+            <w:vAlign w:val="center"/>
+          </w:tcPr>
+          <w:p>
+            <w:pPr>
+              <w:jc w:val="left"/>
+            </w:pPr>
+            <w:r>
+              <w:rPr>
+                <w:rFonts w:ascii="Calibri" w:hAnsi="Calibri"/>
+                <w:color w:val="111827"/>
+                <w:sz w:val="17"/>
+              </w:rPr>
+              <w:t>Policy traces, sealed status, and attack-breakdown reporting.</w:t>
+            </w:r>
+          </w:p>
+        </w:tc>
+      </w:tr>
+      <w:tr>
+        <w:tc>
+          <w:tcPr>
+            <w:tcW w:type="dxa" w:w="3293"/>
+            <w:tcMar>
+              <w:top w:w="80" w:type="dxa"/>
+              <w:start w:w="120" w:type="dxa"/>
+              <w:bottom w:w="80" w:type="dxa"/>
+              <w:end w:w="120" w:type="dxa"/>
+            </w:tcMar>
+            <w:vAlign w:val="center"/>
+          </w:tcPr>
+          <w:p>
+            <w:pPr>
+              <w:jc w:val="left"/>
+            </w:pPr>
+            <w:r>
+              <w:rPr>
+                <w:rFonts w:ascii="Calibri" w:hAnsi="Calibri"/>
+                <w:color w:val="111827"/>
+                <w:sz w:val="17"/>
+              </w:rPr>
+              <w:t>Information disclosure</w:t>
+            </w:r>
+          </w:p>
+        </w:tc>
+        <w:tc>
+          <w:tcPr>
+            <w:tcW w:type="dxa" w:w="3293"/>
+            <w:tcMar>
+              <w:top w:w="80" w:type="dxa"/>
+              <w:start w:w="120" w:type="dxa"/>
+              <w:bottom w:w="80" w:type="dxa"/>
+              <w:end w:w="120" w:type="dxa"/>
+            </w:tcMar>
+            <w:vAlign w:val="center"/>
+          </w:tcPr>
+          <w:p>
+            <w:pPr>
+              <w:jc w:val="left"/>
+            </w:pPr>
+            <w:r>
+              <w:rPr>
+                <w:rFonts w:ascii="Calibri" w:hAnsi="Calibri"/>
+                <w:color w:val="111827"/>
+                <w:sz w:val="17"/>
+              </w:rPr>
+              <w:t>Poisoned memory steers the agent to email or reveal private data.</w:t>
+            </w:r>
+          </w:p>
+        </w:tc>
+        <w:tc>
+          <w:tcPr>
+            <w:tcW w:type="dxa" w:w="3293"/>
+            <w:tcMar>
+              <w:top w:w="80" w:type="dxa"/>
+              <w:start w:w="120" w:type="dxa"/>
+              <w:bottom w:w="80" w:type="dxa"/>
+              <w:end w:w="120" w:type="dxa"/>
+            </w:tcMar>
+            <w:vAlign w:val="center"/>
+          </w:tcPr>
+          <w:p>
+            <w:pPr>
+              <w:jc w:val="left"/>
+            </w:pPr>
+            <w:r>
+              <w:rPr>
+                <w:rFonts w:ascii="Calibri" w:hAnsi="Calibri"/>
+                <w:color w:val="111827"/>
+                <w:sz w:val="17"/>
+              </w:rPr>
+              <w:t>Risk-aware action authorization and evidence quorum for data-sharing actions.</w:t>
+            </w:r>
+          </w:p>
+        </w:tc>
+      </w:tr>
+      <w:tr>
+        <w:tc>
+          <w:tcPr>
+            <w:tcW w:type="dxa" w:w="3293"/>
+            <w:tcMar>
+              <w:top w:w="80" w:type="dxa"/>
+              <w:start w:w="120" w:type="dxa"/>
+              <w:bottom w:w="80" w:type="dxa"/>
+              <w:end w:w="120" w:type="dxa"/>
+            </w:tcMar>
+            <w:vAlign w:val="center"/>
+          </w:tcPr>
+          <w:p>
+            <w:pPr>
+              <w:jc w:val="center"/>
+            </w:pPr>
+            <w:r>
+              <w:rPr>
+                <w:rFonts w:ascii="Calibri" w:hAnsi="Calibri"/>
+                <w:color w:val="111827"/>
+                <w:sz w:val="17"/>
+              </w:rPr>
+              <w:t>Denial of service</w:t>
+            </w:r>
+          </w:p>
+        </w:tc>
+        <w:tc>
+          <w:tcPr>
+            <w:tcW w:type="dxa" w:w="3293"/>
+            <w:tcMar>
+              <w:top w:w="80" w:type="dxa"/>
+              <w:start w:w="120" w:type="dxa"/>
+              <w:bottom w:w="80" w:type="dxa"/>
+              <w:end w:w="120" w:type="dxa"/>
+            </w:tcMar>
+            <w:vAlign w:val="center"/>
+          </w:tcPr>
+          <w:p>
+            <w:pPr>
+              <w:jc w:val="left"/>
+            </w:pPr>
+            <w:r>
+              <w:rPr>
+                <w:rFonts w:ascii="Calibri" w:hAnsi="Calibri"/>
+                <w:color w:val="111827"/>
+                <w:sz w:val="17"/>
+              </w:rPr>
+              <w:t>Overly broad blocking damages benign memory usefulness.</w:t>
+            </w:r>
+          </w:p>
+        </w:tc>
+        <w:tc>
+          <w:tcPr>
+            <w:tcW w:type="dxa" w:w="3293"/>
+            <w:tcMar>
+              <w:top w:w="80" w:type="dxa"/>
+              <w:start w:w="120" w:type="dxa"/>
+              <w:bottom w:w="80" w:type="dxa"/>
+              <w:end w:w="120" w:type="dxa"/>
+            </w:tcMar>
+            <w:vAlign w:val="center"/>
+          </w:tcPr>
+          <w:p>
+            <w:pPr>
+              <w:jc w:val="left"/>
+            </w:pPr>
+            <w:r>
+              <w:rPr>
+                <w:rFonts w:ascii="Calibri" w:hAnsi="Calibri"/>
+                <w:color w:val="111827"/>
+                <w:sz w:val="17"/>
+              </w:rPr>
+              <w:t>Benign accuracy and false-positive rate are measured alongside ASR.</w:t>
+            </w:r>
+          </w:p>
+        </w:tc>
+      </w:tr>
+      <w:tr>
+        <w:tc>
+          <w:tcPr>
+            <w:tcW w:type="dxa" w:w="3293"/>
+            <w:tcMar>
+              <w:top w:w="80" w:type="dxa"/>
+              <w:start w:w="120" w:type="dxa"/>
+              <w:bottom w:w="80" w:type="dxa"/>
+              <w:end w:w="120" w:type="dxa"/>
+            </w:tcMar>
+            <w:vAlign w:val="center"/>
+          </w:tcPr>
+          <w:p>
+            <w:pPr>
+              <w:jc w:val="left"/>
+            </w:pPr>
+            <w:r>
+              <w:rPr>
+                <w:rFonts w:ascii="Calibri" w:hAnsi="Calibri"/>
+                <w:color w:val="111827"/>
+                <w:sz w:val="17"/>
+              </w:rPr>
+              <w:t>Elevation of privilege</w:t>
+            </w:r>
+          </w:p>
+        </w:tc>
+        <w:tc>
+          <w:tcPr>
+            <w:tcW w:type="dxa" w:w="3293"/>
+            <w:tcMar>
+              <w:top w:w="80" w:type="dxa"/>
+              <w:start w:w="120" w:type="dxa"/>
+              <w:bottom w:w="80" w:type="dxa"/>
+              <w:end w:w="120" w:type="dxa"/>
+            </w:tcMar>
+            <w:vAlign w:val="center"/>
+          </w:tcPr>
+          <w:p>
+            <w:pPr>
+              <w:jc w:val="left"/>
+            </w:pPr>
+            <w:r>
+              <w:rPr>
+                <w:rFonts w:ascii="Calibri" w:hAnsi="Calibri"/>
+                <w:color w:val="111827"/>
+                <w:sz w:val="17"/>
+              </w:rPr>
+              <w:t>A low-authority memory becomes action-authorizing evidence.</w:t>
+            </w:r>
+          </w:p>
+        </w:tc>
+        <w:tc>
+          <w:tcPr>
+            <w:tcW w:type="dxa" w:w="3293"/>
+            <w:tcMar>
+              <w:top w:w="80" w:type="dxa"/>
+              <w:start w:w="120" w:type="dxa"/>
+              <w:bottom w:w="80" w:type="dxa"/>
+              <w:end w:w="120" w:type="dxa"/>
+            </w:tcMar>
+            <w:vAlign w:val="center"/>
+          </w:tcPr>
+          <w:p>
+            <w:pPr>
+              <w:jc w:val="left"/>
+            </w:pPr>
+            <w:r>
+              <w:rPr>
+                <w:rFonts w:ascii="Calibri" w:hAnsi="Calibri"/>
+                <w:color w:val="111827"/>
+                <w:sz w:val="17"/>
+              </w:rPr>
+              <w:t>Topic scope, authority floors, influence budgets, and independent quorum.</w:t>
+            </w:r>
+          </w:p>
+        </w:tc>
+      </w:tr>
+    </w:tbl>
+    <w:p>
+      <w:pPr>
+        <w:spacing w:after="60"/>
+      </w:pPr>
+    </w:p>
+    <w:p>
+      <w:pPr>
+        <w:spacing w:after="120" w:line="264" w:lineRule="auto"/>
+      </w:pPr>
+      <w:r>
+        <w:rPr>
+          <w:rFonts w:ascii="Calibri" w:hAnsi="Calibri"/>
+          <w:color w:val="111827"/>
+          <w:sz w:val="21"/>
+        </w:rPr>
+        <w:t>The model aligns most directly with OWASP LLM01 prompt injection, LLM04 data and model poisoning, LLM06 excessive agency, LLM08 vector and embedding weaknesses, and MCP-style tool poisoning. The defense is therefore evaluated as an authorization layer over memory influence rather than as a general jailbreak detector.</w:t>
+      </w:r>
+    </w:p>
+    <w:p>
+      <w:pPr>
+        <w:pStyle w:val="Heading2"/>
+        <w:spacing w:before="180" w:after="100"/>
+      </w:pPr>
+      <w:r>
+        <w:rPr>
+          <w:rFonts w:ascii="Calibri" w:hAnsi="Calibri"/>
+          <w:b/>
+          <w:color w:val="0B2545"/>
+          <w:sz w:val="23"/>
+        </w:rPr>
+        <w:t>4.6 Out-of-Scope Capabilities</w:t>
       </w:r>
     </w:p>
     <w:p>
@@ -1497,7 +3062,7 @@
           <w:color w:val="1F4D78"/>
           <w:sz w:val="19"/>
         </w:rPr>
-        <w:t>Table 2. Capsule fields and their security role.</w:t>
+        <w:t>Table 5. Capsule fields and their security role.</w:t>
       </w:r>
     </w:p>
     <w:tbl>
@@ -2620,7 +4185,7 @@
           <w:color w:val="1F4D78"/>
           <w:sz w:val="19"/>
         </w:rPr>
-        <w:t>Table 3. Implementation components used by the research prototype.</w:t>
+        <w:t>Table 6. Implementation components used by the research prototype.</w:t>
       </w:r>
     </w:p>
     <w:tbl>
@@ -3190,7 +4755,7 @@
           <w:color w:val="1F4D78"/>
           <w:sz w:val="19"/>
         </w:rPr>
-        <w:t>Table 4. Compared agents and what each one tests.</w:t>
+        <w:t>Table 7. Compared agents and what each one tests.</w:t>
       </w:r>
     </w:p>
     <w:tbl>
@@ -3782,7 +5347,7 @@
           <w:color w:val="1F4D78"/>
           <w:sz w:val="19"/>
         </w:rPr>
-        <w:t>Table 5. Attack areas represented in the current simulator.</w:t>
+        <w:t>Table 8. Attack areas represented in the current simulator.</w:t>
       </w:r>
     </w:p>
     <w:tbl>
@@ -4822,7 +6387,7 @@
           <w:color w:val="1F4D78"/>
           <w:sz w:val="19"/>
         </w:rPr>
-        <w:t>Table 6. Held-out workflow-corpus test split.</w:t>
+        <w:t>Table 9. Held-out workflow-corpus test split.</w:t>
       </w:r>
     </w:p>
     <w:tbl>
@@ -5849,7 +7414,7 @@
           <w:color w:val="1F4D78"/>
           <w:sz w:val="19"/>
         </w:rPr>
-        <w:t>Table 7. Stress-suite ASR comparison.</w:t>
+        <w:t>Table 10. Stress-suite ASR comparison.</w:t>
       </w:r>
     </w:p>
     <w:tbl>
@@ -6723,7 +8288,7 @@
           <w:color w:val="1F4D78"/>
           <w:sz w:val="19"/>
         </w:rPr>
-        <w:t>Table 8. Ablation results on the held-out workflow corpus.</w:t>
+        <w:t>Table 11. Ablation results on the held-out workflow corpus.</w:t>
       </w:r>
     </w:p>
     <w:tbl>
@@ -7558,7 +9123,7 @@
           <w:color w:val="1F4D78"/>
           <w:sz w:val="19"/>
         </w:rPr>
-        <w:t>Table 9. Current-main threshold calibration sweep.</w:t>
+        <w:t>Table 12. Current-main threshold calibration sweep.</w:t>
       </w:r>
     </w:p>
     <w:tbl>
@@ -8704,7 +10269,7 @@
           <w:color w:val="1F4D78"/>
           <w:sz w:val="19"/>
         </w:rPr>
-        <w:t>Table 10. Medium live LLM workflow-corpus run.</w:t>
+        <w:t>Table 13. Medium live LLM workflow-corpus run.</w:t>
       </w:r>
     </w:p>
     <w:tbl>
@@ -9298,7 +10863,7 @@
           <w:color w:val="1F4D78"/>
           <w:sz w:val="19"/>
         </w:rPr>
-        <w:t>Table 11. Defended medium live LLM result by model.</w:t>
+        <w:t>Table 14. Defended medium live LLM result by model.</w:t>
       </w:r>
     </w:p>
     <w:tbl>
@@ -9953,7 +11518,7 @@
           <w:color w:val="1F4D78"/>
           <w:sz w:val="19"/>
         </w:rPr>
-        <w:t>Table 12. High-cost local LLM smoke profile.</w:t>
+        <w:t>Table 15. High-cost local LLM smoke profile.</w:t>
       </w:r>
     </w:p>
     <w:tbl>
@@ -10533,7 +12098,7 @@
           <w:color w:val="1F4D78"/>
           <w:sz w:val="19"/>
         </w:rPr>
-        <w:t>Table 13. Why capsule authorization closes tested baseline failures.</w:t>
+        <w:t>Table 16. Why capsule authorization closes tested baseline failures.</w:t>
       </w:r>
     </w:p>
     <w:tbl>

</xml_diff>